<commit_message>
Remove all markdown formatting from both articles, re-export to docx
</commit_message>
<xml_diff>
--- a/ответы/тинькофф-журнал-ии-в-крупных-компаниях.docx
+++ b/ответы/тинькофф-журнал-ии-в-крупных-компаниях.docx
@@ -3,13 +3,11 @@
 <w:document xmlns:wpc="http://schemas.microsoft.com/office/word/2010/wordprocessingCanvas" xmlns:cx="http://schemas.microsoft.com/office/drawing/2014/chartex" xmlns:cx1="http://schemas.microsoft.com/office/drawing/2015/9/8/chartex" xmlns:cx2="http://schemas.microsoft.com/office/drawing/2015/10/21/chartex" xmlns:cx3="http://schemas.microsoft.com/office/drawing/2016/5/9/chartex" xmlns:cx4="http://schemas.microsoft.com/office/drawing/2016/5/10/chartex" xmlns:cx5="http://schemas.microsoft.com/office/drawing/2016/5/11/chartex" xmlns:cx6="http://schemas.microsoft.com/office/drawing/2016/5/12/chartex" xmlns:cx7="http://schemas.microsoft.com/office/drawing/2016/5/13/chartex" xmlns:cx8="http://schemas.microsoft.com/office/drawing/2016/5/14/chartex" xmlns:mc="http://schemas.openxmlformats.org/markup-compatibility/2006" xmlns:aink="http://schemas.microsoft.com/office/drawing/2016/ink" xmlns:am3d="http://schemas.microsoft.com/office/drawing/2017/model3d" xmlns:o="urn:schemas-microsoft-com:office:office" xmlns:oel="http://schemas.microsoft.com/office/2019/extlst" xmlns:r="http://schemas.openxmlformats.org/officeDocument/2006/relationships" xmlns:m="http://schemas.openxmlformats.org/officeDocument/2006/math" xmlns:v="urn:schemas-microsoft-com:vml" xmlns:wp14="http://schemas.microsoft.com/office/word/2010/wordprocessingDrawing" xmlns:wp="http://schemas.openxmlformats.org/drawingml/2006/wordprocessingDrawing" xmlns:w10="urn:schemas-microsoft-com:office:word" xmlns:w="http://schemas.openxmlformats.org/wordprocessingml/2006/main" xmlns:w14="http://schemas.microsoft.com/office/word/2010/wordml" xmlns:w15="http://schemas.microsoft.com/office/word/2012/wordml" xmlns:w16cex="http://schemas.microsoft.com/office/word/2018/wordml/cex" xmlns:w16cid="http://schemas.microsoft.com/office/word/2016/wordml/cid" xmlns:w16="http://schemas.microsoft.com/office/word/2018/wordml" xmlns:w16sdtdh="http://schemas.microsoft.com/office/word/2020/wordml/sdtdatahash" xmlns:w16se="http://schemas.microsoft.com/office/word/2015/wordml/symex" xmlns:wpg="http://schemas.microsoft.com/office/word/2010/wordprocessingGroup" xmlns:wpi="http://schemas.microsoft.com/office/word/2010/wordprocessingInk" xmlns:wne="http://schemas.microsoft.com/office/word/2006/wordml" xmlns:wps="http://schemas.microsoft.com/office/word/2010/wordprocessingShape" mc:Ignorable="w14 w15 w16se w16cid w16 w16cex w16sdtdh wp14">
   <w:body>
     <w:p>
-      <w:pPr>
-        <w:pStyle w:val="1"/>
-      </w:pPr>
       <w:r>
         <w:t>ИИ в крупных компаниях: где реальная экономия, а где иллюзия эффективности</w:t>
       </w:r>
     </w:p>
+    <w:p/>
     <w:p>
       <w:r>
         <w:t>Статья для Тинькофф Журнала</w:t>
@@ -27,14 +25,13 @@
       </w:r>
     </w:p>
     <w:p/>
-    <w:p>
-      <w:pPr>
-        <w:pStyle w:val="2"/>
-      </w:pPr>
+    <w:p/>
+    <w:p>
       <w:r>
         <w:t>В каких сферах крупных компаний чаще всего применяют ИИ и почему?</w:t>
       </w:r>
     </w:p>
+    <w:p/>
     <w:p>
       <w:r>
         <w:t>Если коротко — там, где есть большой поток однотипных операций и высокая цена ошибки.</w:t>
@@ -71,14 +68,13 @@
       </w:r>
     </w:p>
     <w:p/>
-    <w:p>
-      <w:pPr>
-        <w:pStyle w:val="2"/>
-      </w:pPr>
+    <w:p/>
+    <w:p>
       <w:r>
         <w:t>Как крупные компании экономят деньги с помощью ИИ?</w:t>
       </w:r>
     </w:p>
+    <w:p/>
     <w:p>
       <w:r>
         <w:t>Экономия бывает двух видов: прямая — когда убирают людей или процессы, и косвенная — когда снижают потери.</w:t>
@@ -103,14 +99,13 @@
       </w:r>
     </w:p>
     <w:p/>
-    <w:p>
-      <w:pPr>
-        <w:pStyle w:val="2"/>
-      </w:pPr>
+    <w:p/>
+    <w:p>
       <w:r>
         <w:t>Почему внедрение ИИ иногда не даёт результата?</w:t>
       </w:r>
     </w:p>
+    <w:p/>
     <w:p>
       <w:r>
         <w:t>Это случается чаще, чем принято признавать публично. Есть несколько типичных причин.</w:t>
@@ -119,13 +114,13 @@
     <w:p/>
     <w:p>
       <w:r>
-        <w:t>Проблема первая — «мусорные» данные. ИИ обучается на исторических данных компании. Если данные неполные, несогласованные или устаревшие — модель воспроизводит ошибки прошлого с высокой точностью. Один крупный ретейлер потратил год на внедрение системы прогнозирования спроса, которая давала худшие результаты, чем Excel-таблицы менеджеров, — потому что данные из разных филиалов вносились по разным правилам.</w:t>
-      </w:r>
-    </w:p>
-    <w:p/>
-    <w:p>
-      <w:r>
-        <w:t>Проблема вторая — внедрение ради галочки. Компания покупает дорогое решение, чтобы отчитаться перед советом директоров о «цифровизации». Систему внедряют, но под неё не перестраивают процессы. Люди работают по-старому, параллельно заполняя новую систему — KPI не меняются, эффект нулевой.</w:t>
+        <w:t>Проблема первая — мусорные данные. ИИ обучается на исторических данных компании. Если данные неполные, несогласованные или устаревшие — модель воспроизводит ошибки прошлого с высокой точностью. Один крупный ретейлер потратил год на внедрение системы прогнозирования спроса, которая давала худшие результаты, чем Excel-таблицы менеджеров, — потому что данные из разных филиалов вносились по разным правилам.</w:t>
+      </w:r>
+    </w:p>
+    <w:p/>
+    <w:p>
+      <w:r>
+        <w:t>Проблема вторая — внедрение ради галочки. Компания покупает дорогое решение, чтобы отчитаться перед советом директоров о цифровизации. Систему внедряют, но под неё не перестраивают процессы. Люди работают по-старому, параллельно заполняя новую систему — KPI не меняются, эффект нулевой.</w:t>
       </w:r>
     </w:p>
     <w:p/>
@@ -137,21 +132,20 @@
     <w:p/>
     <w:p>
       <w:r>
-        <w:t>Как избежать. Начинать с аудита данных, а не с выбора вендора. Ставить конкретную измеримую задачу: не «внедрить ИИ», а «снизить время обработки заявки с 3 дней до 4 часов». Пилотировать на одном подразделении, считать результат, масштабировать только то, что доказало эффективность. И обязательно объяснять сотрудникам, что именно меняется и зачем.</w:t>
-      </w:r>
-    </w:p>
-    <w:p/>
-    <w:p>
-      <w:pPr>
-        <w:pStyle w:val="2"/>
-      </w:pPr>
+        <w:t>Как избежать. Начинать с аудита данных, а не с выбора вендора. Ставить конкретную измеримую задачу: не внедрить ИИ, а снизить время обработки заявки с 3 дней до 4 часов. Пилотировать на одном подразделении, считать результат, масштабировать только то, что доказало эффективность. И обязательно объяснять сотрудникам, что именно меняется и зачем.</w:t>
+      </w:r>
+    </w:p>
+    <w:p/>
+    <w:p/>
+    <w:p>
       <w:r>
         <w:t>Какие новые возможности даёт ИИ для анализа больших данных?</w:t>
       </w:r>
     </w:p>
-    <w:p>
-      <w:r>
-        <w:t>Ключевое слово — «новые». Речь не о том, чтобы быстрее делать то, что раньше делали медленно. Речь о задачах, которые раньше были физически невозможны.</w:t>
+    <w:p/>
+    <w:p>
+      <w:r>
+        <w:t>Ключевое слово — новые. Речь не о том, чтобы быстрее делать то, что раньше делали медленно. Речь о задачах, которые раньше были физически невозможны.</w:t>
       </w:r>
     </w:p>
     <w:p/>
@@ -173,14 +167,13 @@
       </w:r>
     </w:p>
     <w:p/>
-    <w:p>
-      <w:pPr>
-        <w:pStyle w:val="2"/>
-      </w:pPr>
+    <w:p/>
+    <w:p>
       <w:r>
         <w:t>Как ИИ помогает руководителям принимать решения?</w:t>
       </w:r>
     </w:p>
+    <w:p/>
     <w:p>
       <w:r>
         <w:t>Топ-менеджер крупной компании принимает десятки решений в день, каждое из которых опирается на неполную информацию. ИИ не принимает решения за него — но меняет качество информации, с которой он работает.</w:t>
@@ -195,7 +188,7 @@
     <w:p/>
     <w:p>
       <w:r>
-        <w:t>Сценарное моделирование. «Что будет, если мы поднимем цену на 10%?», «Как изменится маржа, если логистика подорожает?» — раньше такой анализ занимал недели работы аналитиков. Сейчас — минуты. Это позволяет проверять больше гипотез и принимать решения с большей уверенностью.</w:t>
+        <w:t>Сценарное моделирование. Что будет, если мы поднимем цену на 10%? Как изменится маржа, если логистика подорожает? Раньше такой анализ занимал недели работы аналитиков. Сейчас — минуты. Это позволяет проверять больше гипотез и принимать решения с большей уверенностью.</w:t>
       </w:r>
     </w:p>
     <w:p/>
@@ -207,18 +200,17 @@
     <w:p/>
     <w:p>
       <w:r>
-        <w:t>Главный инструмент здесь — не конкретный продукт, а принцип: ИИ должен сокращать время от вопроса до ответа, не создавая новый слой сложности.</w:t>
-      </w:r>
-    </w:p>
-    <w:p/>
-    <w:p>
-      <w:pPr>
-        <w:pStyle w:val="2"/>
-      </w:pPr>
-      <w:r>
-        <w:t>Этика и законы: что нельзя игнорировать</w:t>
-      </w:r>
-    </w:p>
+        <w:t>Главный принцип: ИИ должен сокращать время от вопроса до ответа, не создавая новый слой сложности.</w:t>
+      </w:r>
+    </w:p>
+    <w:p/>
+    <w:p/>
+    <w:p>
+      <w:r>
+        <w:t>Этика и законы: на что нужно обращать внимание при внедрении ИИ в крупных компаниях?</w:t>
+      </w:r>
+    </w:p>
+    <w:p/>
     <w:p>
       <w:r>
         <w:t>Это не абстрактная тема для корпоративных ESG-отчётов. Это реальные риски, которые уже стоили компаниям денег и репутации.</w:t>
@@ -239,7 +231,7 @@
     <w:p/>
     <w:p>
       <w:r>
-        <w:t>Объяснимость решений. Если ИИ отказал клиенту в кредите или уволил сотрудника по результатам оценки — компания должна быть готова объяснить, почему. «Алгоритм так решил» — не является юридически приемлемым ответом в большинстве юрисдикций. Это требует использования объяснимых моделей или дополнительного слоя интерпретации.</w:t>
+        <w:t>Объяснимость решений. Если ИИ отказал клиенту в кредите или уволил сотрудника по результатам оценки — компания должна быть готова объяснить, почему. «Алгоритм так решил» не является юридически приемлемым ответом в большинстве юрисдикций. Это требует использования объяснимых моделей или дополнительного слоя интерпретации.</w:t>
       </w:r>
     </w:p>
     <w:p/>
@@ -255,11 +247,13 @@
       </w:r>
     </w:p>
     <w:p/>
+    <w:p/>
     <w:p>
       <w:r>
         <w:t>Эксперт: [Имя, должность, компания]</w:t>
       </w:r>
     </w:p>
+    <w:p/>
     <w:sectPr>
       <w:pgSz w:w="11906" w:h="16838"/>
       <w:pgMar w:top="1134" w:right="850" w:bottom="1134" w:left="1701" w:header="708" w:footer="708" w:gutter="0"/>
@@ -678,7 +672,7 @@
     <w:link w:val="10"/>
     <w:uiPriority w:val="9"/>
     <w:qFormat/>
-    <w:rsid w:val="00747413"/>
+    <w:rsid w:val="00850458"/>
     <w:pPr>
       <w:keepNext/>
       <w:keepLines/>
@@ -698,9 +692,10 @@
     <w:next w:val="a"/>
     <w:link w:val="20"/>
     <w:uiPriority w:val="9"/>
+    <w:semiHidden/>
     <w:unhideWhenUsed/>
     <w:qFormat/>
-    <w:rsid w:val="00747413"/>
+    <w:rsid w:val="00850458"/>
     <w:pPr>
       <w:keepNext/>
       <w:keepLines/>
@@ -723,7 +718,7 @@
     <w:semiHidden/>
     <w:unhideWhenUsed/>
     <w:qFormat/>
-    <w:rsid w:val="00747413"/>
+    <w:rsid w:val="00850458"/>
     <w:pPr>
       <w:keepNext/>
       <w:keepLines/>
@@ -746,7 +741,7 @@
     <w:semiHidden/>
     <w:unhideWhenUsed/>
     <w:qFormat/>
-    <w:rsid w:val="00747413"/>
+    <w:rsid w:val="00850458"/>
     <w:pPr>
       <w:keepNext/>
       <w:keepLines/>
@@ -769,7 +764,7 @@
     <w:semiHidden/>
     <w:unhideWhenUsed/>
     <w:qFormat/>
-    <w:rsid w:val="00747413"/>
+    <w:rsid w:val="00850458"/>
     <w:pPr>
       <w:keepNext/>
       <w:keepLines/>
@@ -790,7 +785,7 @@
     <w:semiHidden/>
     <w:unhideWhenUsed/>
     <w:qFormat/>
-    <w:rsid w:val="00747413"/>
+    <w:rsid w:val="00850458"/>
     <w:pPr>
       <w:keepNext/>
       <w:keepLines/>
@@ -813,7 +808,7 @@
     <w:semiHidden/>
     <w:unhideWhenUsed/>
     <w:qFormat/>
-    <w:rsid w:val="00747413"/>
+    <w:rsid w:val="00850458"/>
     <w:pPr>
       <w:keepNext/>
       <w:keepLines/>
@@ -834,7 +829,7 @@
     <w:semiHidden/>
     <w:unhideWhenUsed/>
     <w:qFormat/>
-    <w:rsid w:val="00747413"/>
+    <w:rsid w:val="00850458"/>
     <w:pPr>
       <w:keepNext/>
       <w:keepLines/>
@@ -857,7 +852,7 @@
     <w:semiHidden/>
     <w:unhideWhenUsed/>
     <w:qFormat/>
-    <w:rsid w:val="00747413"/>
+    <w:rsid w:val="00850458"/>
     <w:pPr>
       <w:keepNext/>
       <w:keepLines/>
@@ -901,7 +896,7 @@
     <w:basedOn w:val="a0"/>
     <w:link w:val="1"/>
     <w:uiPriority w:val="9"/>
-    <w:rsid w:val="00747413"/>
+    <w:rsid w:val="00850458"/>
     <w:rPr>
       <w:rFonts w:asciiTheme="majorHAnsi" w:eastAsiaTheme="majorEastAsia" w:hAnsiTheme="majorHAnsi" w:cstheme="majorBidi"/>
       <w:color w:val="0F4761" w:themeColor="accent1" w:themeShade="BF"/>
@@ -914,7 +909,8 @@
     <w:basedOn w:val="a0"/>
     <w:link w:val="2"/>
     <w:uiPriority w:val="9"/>
-    <w:rsid w:val="00747413"/>
+    <w:semiHidden/>
+    <w:rsid w:val="00850458"/>
     <w:rPr>
       <w:rFonts w:asciiTheme="majorHAnsi" w:eastAsiaTheme="majorEastAsia" w:hAnsiTheme="majorHAnsi" w:cstheme="majorBidi"/>
       <w:color w:val="0F4761" w:themeColor="accent1" w:themeShade="BF"/>
@@ -928,7 +924,7 @@
     <w:link w:val="3"/>
     <w:uiPriority w:val="9"/>
     <w:semiHidden/>
-    <w:rsid w:val="00747413"/>
+    <w:rsid w:val="00850458"/>
     <w:rPr>
       <w:rFonts w:eastAsiaTheme="majorEastAsia" w:cstheme="majorBidi"/>
       <w:color w:val="0F4761" w:themeColor="accent1" w:themeShade="BF"/>
@@ -942,7 +938,7 @@
     <w:link w:val="4"/>
     <w:uiPriority w:val="9"/>
     <w:semiHidden/>
-    <w:rsid w:val="00747413"/>
+    <w:rsid w:val="00850458"/>
     <w:rPr>
       <w:rFonts w:eastAsiaTheme="majorEastAsia" w:cstheme="majorBidi"/>
       <w:i/>
@@ -956,7 +952,7 @@
     <w:link w:val="5"/>
     <w:uiPriority w:val="9"/>
     <w:semiHidden/>
-    <w:rsid w:val="00747413"/>
+    <w:rsid w:val="00850458"/>
     <w:rPr>
       <w:rFonts w:eastAsiaTheme="majorEastAsia" w:cstheme="majorBidi"/>
       <w:color w:val="0F4761" w:themeColor="accent1" w:themeShade="BF"/>
@@ -968,7 +964,7 @@
     <w:link w:val="6"/>
     <w:uiPriority w:val="9"/>
     <w:semiHidden/>
-    <w:rsid w:val="00747413"/>
+    <w:rsid w:val="00850458"/>
     <w:rPr>
       <w:rFonts w:eastAsiaTheme="majorEastAsia" w:cstheme="majorBidi"/>
       <w:i/>
@@ -982,7 +978,7 @@
     <w:link w:val="7"/>
     <w:uiPriority w:val="9"/>
     <w:semiHidden/>
-    <w:rsid w:val="00747413"/>
+    <w:rsid w:val="00850458"/>
     <w:rPr>
       <w:rFonts w:eastAsiaTheme="majorEastAsia" w:cstheme="majorBidi"/>
       <w:color w:val="595959" w:themeColor="text1" w:themeTint="A6"/>
@@ -994,7 +990,7 @@
     <w:link w:val="8"/>
     <w:uiPriority w:val="9"/>
     <w:semiHidden/>
-    <w:rsid w:val="00747413"/>
+    <w:rsid w:val="00850458"/>
     <w:rPr>
       <w:rFonts w:eastAsiaTheme="majorEastAsia" w:cstheme="majorBidi"/>
       <w:i/>
@@ -1008,7 +1004,7 @@
     <w:link w:val="9"/>
     <w:uiPriority w:val="9"/>
     <w:semiHidden/>
-    <w:rsid w:val="00747413"/>
+    <w:rsid w:val="00850458"/>
     <w:rPr>
       <w:rFonts w:eastAsiaTheme="majorEastAsia" w:cstheme="majorBidi"/>
       <w:color w:val="272727" w:themeColor="text1" w:themeTint="D8"/>
@@ -1021,7 +1017,7 @@
     <w:link w:val="a4"/>
     <w:uiPriority w:val="10"/>
     <w:qFormat/>
-    <w:rsid w:val="00747413"/>
+    <w:rsid w:val="00850458"/>
     <w:pPr>
       <w:spacing w:after="80" w:line="240" w:lineRule="auto"/>
       <w:contextualSpacing/>
@@ -1039,7 +1035,7 @@
     <w:basedOn w:val="a0"/>
     <w:link w:val="a3"/>
     <w:uiPriority w:val="10"/>
-    <w:rsid w:val="00747413"/>
+    <w:rsid w:val="00850458"/>
     <w:rPr>
       <w:rFonts w:asciiTheme="majorHAnsi" w:eastAsiaTheme="majorEastAsia" w:hAnsiTheme="majorHAnsi" w:cstheme="majorBidi"/>
       <w:spacing w:val="-10"/>
@@ -1055,7 +1051,7 @@
     <w:link w:val="a6"/>
     <w:uiPriority w:val="11"/>
     <w:qFormat/>
-    <w:rsid w:val="00747413"/>
+    <w:rsid w:val="00850458"/>
     <w:pPr>
       <w:numPr>
         <w:ilvl w:val="1"/>
@@ -1074,7 +1070,7 @@
     <w:basedOn w:val="a0"/>
     <w:link w:val="a5"/>
     <w:uiPriority w:val="11"/>
-    <w:rsid w:val="00747413"/>
+    <w:rsid w:val="00850458"/>
     <w:rPr>
       <w:rFonts w:eastAsiaTheme="majorEastAsia" w:cstheme="majorBidi"/>
       <w:color w:val="595959" w:themeColor="text1" w:themeTint="A6"/>
@@ -1090,7 +1086,7 @@
     <w:link w:val="22"/>
     <w:uiPriority w:val="29"/>
     <w:qFormat/>
-    <w:rsid w:val="00747413"/>
+    <w:rsid w:val="00850458"/>
     <w:pPr>
       <w:spacing w:before="160"/>
       <w:jc w:val="center"/>
@@ -1106,7 +1102,7 @@
     <w:basedOn w:val="a0"/>
     <w:link w:val="21"/>
     <w:uiPriority w:val="29"/>
-    <w:rsid w:val="00747413"/>
+    <w:rsid w:val="00850458"/>
     <w:rPr>
       <w:i/>
       <w:iCs/>
@@ -1118,7 +1114,7 @@
     <w:basedOn w:val="a"/>
     <w:uiPriority w:val="34"/>
     <w:qFormat/>
-    <w:rsid w:val="00747413"/>
+    <w:rsid w:val="00850458"/>
     <w:pPr>
       <w:ind w:left="720"/>
       <w:contextualSpacing/>
@@ -1129,7 +1125,7 @@
     <w:basedOn w:val="a0"/>
     <w:uiPriority w:val="21"/>
     <w:qFormat/>
-    <w:rsid w:val="00747413"/>
+    <w:rsid w:val="00850458"/>
     <w:rPr>
       <w:i/>
       <w:iCs/>
@@ -1143,7 +1139,7 @@
     <w:link w:val="aa"/>
     <w:uiPriority w:val="30"/>
     <w:qFormat/>
-    <w:rsid w:val="00747413"/>
+    <w:rsid w:val="00850458"/>
     <w:pPr>
       <w:pBdr>
         <w:top w:val="single" w:sz="4" w:space="10" w:color="0F4761" w:themeColor="accent1" w:themeShade="BF"/>
@@ -1164,7 +1160,7 @@
     <w:basedOn w:val="a0"/>
     <w:link w:val="a9"/>
     <w:uiPriority w:val="30"/>
-    <w:rsid w:val="00747413"/>
+    <w:rsid w:val="00850458"/>
     <w:rPr>
       <w:i/>
       <w:iCs/>
@@ -1176,7 +1172,7 @@
     <w:basedOn w:val="a0"/>
     <w:uiPriority w:val="32"/>
     <w:qFormat/>
-    <w:rsid w:val="00747413"/>
+    <w:rsid w:val="00850458"/>
     <w:rPr>
       <w:b/>
       <w:bCs/>

</xml_diff>

<commit_message>
Strip expert/publication metadata from articles, keep title + text only
</commit_message>
<xml_diff>
--- a/ответы/тинькофф-журнал-ии-в-крупных-компаниях.docx
+++ b/ответы/тинькофф-журнал-ии-в-крупных-компаниях.docx
@@ -10,17 +10,6 @@
     <w:p/>
     <w:p>
       <w:r>
-        <w:t>Статья для Тинькофф Журнала</w:t>
-      </w:r>
-    </w:p>
-    <w:p>
-      <w:r>
-        <w:t>Дата: 2026-06-16</w:t>
-      </w:r>
-    </w:p>
-    <w:p/>
-    <w:p>
-      <w:r>
         <w:t>Искусственный интеллект перестал быть темой конференций — он стал строчкой в бюджете. Крупные компании тратят на ИИ сотни миллионов рублей в год, и вопрос уже не «внедрять или нет», а «где это реально работает, а где деньги уходят впустую».</w:t>
       </w:r>
     </w:p>
@@ -244,13 +233,6 @@
     <w:p>
       <w:r>
         <w:t>Компании, которые встраивают этику в архитектуру своих ИИ-систем с самого начала, тратят на это меньше, чем те, кто исправляет последствия потом.</w:t>
-      </w:r>
-    </w:p>
-    <w:p/>
-    <w:p/>
-    <w:p>
-      <w:r>
-        <w:t>Эксперт: [Имя, должность, компания]</w:t>
       </w:r>
     </w:p>
     <w:p/>
@@ -672,7 +654,7 @@
     <w:link w:val="10"/>
     <w:uiPriority w:val="9"/>
     <w:qFormat/>
-    <w:rsid w:val="00850458"/>
+    <w:rsid w:val="00436E07"/>
     <w:pPr>
       <w:keepNext/>
       <w:keepLines/>
@@ -695,7 +677,7 @@
     <w:semiHidden/>
     <w:unhideWhenUsed/>
     <w:qFormat/>
-    <w:rsid w:val="00850458"/>
+    <w:rsid w:val="00436E07"/>
     <w:pPr>
       <w:keepNext/>
       <w:keepLines/>
@@ -718,7 +700,7 @@
     <w:semiHidden/>
     <w:unhideWhenUsed/>
     <w:qFormat/>
-    <w:rsid w:val="00850458"/>
+    <w:rsid w:val="00436E07"/>
     <w:pPr>
       <w:keepNext/>
       <w:keepLines/>
@@ -741,7 +723,7 @@
     <w:semiHidden/>
     <w:unhideWhenUsed/>
     <w:qFormat/>
-    <w:rsid w:val="00850458"/>
+    <w:rsid w:val="00436E07"/>
     <w:pPr>
       <w:keepNext/>
       <w:keepLines/>
@@ -764,7 +746,7 @@
     <w:semiHidden/>
     <w:unhideWhenUsed/>
     <w:qFormat/>
-    <w:rsid w:val="00850458"/>
+    <w:rsid w:val="00436E07"/>
     <w:pPr>
       <w:keepNext/>
       <w:keepLines/>
@@ -785,7 +767,7 @@
     <w:semiHidden/>
     <w:unhideWhenUsed/>
     <w:qFormat/>
-    <w:rsid w:val="00850458"/>
+    <w:rsid w:val="00436E07"/>
     <w:pPr>
       <w:keepNext/>
       <w:keepLines/>
@@ -808,7 +790,7 @@
     <w:semiHidden/>
     <w:unhideWhenUsed/>
     <w:qFormat/>
-    <w:rsid w:val="00850458"/>
+    <w:rsid w:val="00436E07"/>
     <w:pPr>
       <w:keepNext/>
       <w:keepLines/>
@@ -829,7 +811,7 @@
     <w:semiHidden/>
     <w:unhideWhenUsed/>
     <w:qFormat/>
-    <w:rsid w:val="00850458"/>
+    <w:rsid w:val="00436E07"/>
     <w:pPr>
       <w:keepNext/>
       <w:keepLines/>
@@ -852,7 +834,7 @@
     <w:semiHidden/>
     <w:unhideWhenUsed/>
     <w:qFormat/>
-    <w:rsid w:val="00850458"/>
+    <w:rsid w:val="00436E07"/>
     <w:pPr>
       <w:keepNext/>
       <w:keepLines/>
@@ -896,7 +878,7 @@
     <w:basedOn w:val="a0"/>
     <w:link w:val="1"/>
     <w:uiPriority w:val="9"/>
-    <w:rsid w:val="00850458"/>
+    <w:rsid w:val="00436E07"/>
     <w:rPr>
       <w:rFonts w:asciiTheme="majorHAnsi" w:eastAsiaTheme="majorEastAsia" w:hAnsiTheme="majorHAnsi" w:cstheme="majorBidi"/>
       <w:color w:val="0F4761" w:themeColor="accent1" w:themeShade="BF"/>
@@ -910,7 +892,7 @@
     <w:link w:val="2"/>
     <w:uiPriority w:val="9"/>
     <w:semiHidden/>
-    <w:rsid w:val="00850458"/>
+    <w:rsid w:val="00436E07"/>
     <w:rPr>
       <w:rFonts w:asciiTheme="majorHAnsi" w:eastAsiaTheme="majorEastAsia" w:hAnsiTheme="majorHAnsi" w:cstheme="majorBidi"/>
       <w:color w:val="0F4761" w:themeColor="accent1" w:themeShade="BF"/>
@@ -924,7 +906,7 @@
     <w:link w:val="3"/>
     <w:uiPriority w:val="9"/>
     <w:semiHidden/>
-    <w:rsid w:val="00850458"/>
+    <w:rsid w:val="00436E07"/>
     <w:rPr>
       <w:rFonts w:eastAsiaTheme="majorEastAsia" w:cstheme="majorBidi"/>
       <w:color w:val="0F4761" w:themeColor="accent1" w:themeShade="BF"/>
@@ -938,7 +920,7 @@
     <w:link w:val="4"/>
     <w:uiPriority w:val="9"/>
     <w:semiHidden/>
-    <w:rsid w:val="00850458"/>
+    <w:rsid w:val="00436E07"/>
     <w:rPr>
       <w:rFonts w:eastAsiaTheme="majorEastAsia" w:cstheme="majorBidi"/>
       <w:i/>
@@ -952,7 +934,7 @@
     <w:link w:val="5"/>
     <w:uiPriority w:val="9"/>
     <w:semiHidden/>
-    <w:rsid w:val="00850458"/>
+    <w:rsid w:val="00436E07"/>
     <w:rPr>
       <w:rFonts w:eastAsiaTheme="majorEastAsia" w:cstheme="majorBidi"/>
       <w:color w:val="0F4761" w:themeColor="accent1" w:themeShade="BF"/>
@@ -964,7 +946,7 @@
     <w:link w:val="6"/>
     <w:uiPriority w:val="9"/>
     <w:semiHidden/>
-    <w:rsid w:val="00850458"/>
+    <w:rsid w:val="00436E07"/>
     <w:rPr>
       <w:rFonts w:eastAsiaTheme="majorEastAsia" w:cstheme="majorBidi"/>
       <w:i/>
@@ -978,7 +960,7 @@
     <w:link w:val="7"/>
     <w:uiPriority w:val="9"/>
     <w:semiHidden/>
-    <w:rsid w:val="00850458"/>
+    <w:rsid w:val="00436E07"/>
     <w:rPr>
       <w:rFonts w:eastAsiaTheme="majorEastAsia" w:cstheme="majorBidi"/>
       <w:color w:val="595959" w:themeColor="text1" w:themeTint="A6"/>
@@ -990,7 +972,7 @@
     <w:link w:val="8"/>
     <w:uiPriority w:val="9"/>
     <w:semiHidden/>
-    <w:rsid w:val="00850458"/>
+    <w:rsid w:val="00436E07"/>
     <w:rPr>
       <w:rFonts w:eastAsiaTheme="majorEastAsia" w:cstheme="majorBidi"/>
       <w:i/>
@@ -1004,7 +986,7 @@
     <w:link w:val="9"/>
     <w:uiPriority w:val="9"/>
     <w:semiHidden/>
-    <w:rsid w:val="00850458"/>
+    <w:rsid w:val="00436E07"/>
     <w:rPr>
       <w:rFonts w:eastAsiaTheme="majorEastAsia" w:cstheme="majorBidi"/>
       <w:color w:val="272727" w:themeColor="text1" w:themeTint="D8"/>
@@ -1017,7 +999,7 @@
     <w:link w:val="a4"/>
     <w:uiPriority w:val="10"/>
     <w:qFormat/>
-    <w:rsid w:val="00850458"/>
+    <w:rsid w:val="00436E07"/>
     <w:pPr>
       <w:spacing w:after="80" w:line="240" w:lineRule="auto"/>
       <w:contextualSpacing/>
@@ -1035,7 +1017,7 @@
     <w:basedOn w:val="a0"/>
     <w:link w:val="a3"/>
     <w:uiPriority w:val="10"/>
-    <w:rsid w:val="00850458"/>
+    <w:rsid w:val="00436E07"/>
     <w:rPr>
       <w:rFonts w:asciiTheme="majorHAnsi" w:eastAsiaTheme="majorEastAsia" w:hAnsiTheme="majorHAnsi" w:cstheme="majorBidi"/>
       <w:spacing w:val="-10"/>
@@ -1051,7 +1033,7 @@
     <w:link w:val="a6"/>
     <w:uiPriority w:val="11"/>
     <w:qFormat/>
-    <w:rsid w:val="00850458"/>
+    <w:rsid w:val="00436E07"/>
     <w:pPr>
       <w:numPr>
         <w:ilvl w:val="1"/>
@@ -1070,7 +1052,7 @@
     <w:basedOn w:val="a0"/>
     <w:link w:val="a5"/>
     <w:uiPriority w:val="11"/>
-    <w:rsid w:val="00850458"/>
+    <w:rsid w:val="00436E07"/>
     <w:rPr>
       <w:rFonts w:eastAsiaTheme="majorEastAsia" w:cstheme="majorBidi"/>
       <w:color w:val="595959" w:themeColor="text1" w:themeTint="A6"/>
@@ -1086,7 +1068,7 @@
     <w:link w:val="22"/>
     <w:uiPriority w:val="29"/>
     <w:qFormat/>
-    <w:rsid w:val="00850458"/>
+    <w:rsid w:val="00436E07"/>
     <w:pPr>
       <w:spacing w:before="160"/>
       <w:jc w:val="center"/>
@@ -1102,7 +1084,7 @@
     <w:basedOn w:val="a0"/>
     <w:link w:val="21"/>
     <w:uiPriority w:val="29"/>
-    <w:rsid w:val="00850458"/>
+    <w:rsid w:val="00436E07"/>
     <w:rPr>
       <w:i/>
       <w:iCs/>
@@ -1114,7 +1096,7 @@
     <w:basedOn w:val="a"/>
     <w:uiPriority w:val="34"/>
     <w:qFormat/>
-    <w:rsid w:val="00850458"/>
+    <w:rsid w:val="00436E07"/>
     <w:pPr>
       <w:ind w:left="720"/>
       <w:contextualSpacing/>
@@ -1125,7 +1107,7 @@
     <w:basedOn w:val="a0"/>
     <w:uiPriority w:val="21"/>
     <w:qFormat/>
-    <w:rsid w:val="00850458"/>
+    <w:rsid w:val="00436E07"/>
     <w:rPr>
       <w:i/>
       <w:iCs/>
@@ -1139,7 +1121,7 @@
     <w:link w:val="aa"/>
     <w:uiPriority w:val="30"/>
     <w:qFormat/>
-    <w:rsid w:val="00850458"/>
+    <w:rsid w:val="00436E07"/>
     <w:pPr>
       <w:pBdr>
         <w:top w:val="single" w:sz="4" w:space="10" w:color="0F4761" w:themeColor="accent1" w:themeShade="BF"/>
@@ -1160,7 +1142,7 @@
     <w:basedOn w:val="a0"/>
     <w:link w:val="a9"/>
     <w:uiPriority w:val="30"/>
-    <w:rsid w:val="00850458"/>
+    <w:rsid w:val="00436E07"/>
     <w:rPr>
       <w:i/>
       <w:iCs/>
@@ -1172,7 +1154,7 @@
     <w:basedOn w:val="a0"/>
     <w:uiPriority w:val="32"/>
     <w:qFormat/>
-    <w:rsid w:val="00850458"/>
+    <w:rsid w:val="00436E07"/>
     <w:rPr>
       <w:b/>
       <w:bCs/>

</xml_diff>

<commit_message>
Reduce colons and dashes throughout both articles, re-export docx
</commit_message>
<xml_diff>
--- a/ответы/тинькофф-журнал-ии-в-крупных-компаниях.docx
+++ b/ответы/тинькофф-журнал-ии-в-крупных-компаниях.docx
@@ -10,7 +10,7 @@
     <w:p/>
     <w:p>
       <w:r>
-        <w:t>Искусственный интеллект перестал быть темой конференций — он стал строчкой в бюджете. Крупные компании тратят на ИИ сотни миллионов рублей в год, и вопрос уже не «внедрять или нет», а «где это реально работает, а где деньги уходят впустую».</w:t>
+        <w:t>Искусственный интеллект перестал быть темой конференций и стал строчкой в бюджете. Крупные компании тратят на него сотни миллионов рублей в год, и вопрос уже не в том, внедрять или нет, а в том, где это реально работает, а где деньги уходят впустую.</w:t>
       </w:r>
     </w:p>
     <w:p/>
@@ -23,37 +23,37 @@
     <w:p/>
     <w:p>
       <w:r>
-        <w:t>Если коротко — там, где есть большой поток однотипных операций и высокая цена ошибки.</w:t>
-      </w:r>
-    </w:p>
-    <w:p/>
-    <w:p>
-      <w:r>
-        <w:t>Первое место — клиентский сервис. Чат-боты и голосовые ассистенты закрывают до 70–80% обращений без участия живого оператора. Банки, телекомы, ретейлеры — все, у кого колл-центр стоит в год сотни миллионов рублей, уже там.</w:t>
-      </w:r>
-    </w:p>
-    <w:p/>
-    <w:p>
-      <w:r>
-        <w:t>Второе — производство и логистика. Предиктивное обслуживание оборудования: ИИ анализирует вибрацию, температуру, нагрузку и предупреждает о поломке за несколько дней до того, как она произойдёт. На крупном заводе один незапланированный простой линии — это десятки миллионов рублей убытков.</w:t>
-      </w:r>
-    </w:p>
-    <w:p/>
-    <w:p>
-      <w:r>
-        <w:t>Третье — финансы и безопасность. Антифрод-системы, кредитный скоринг, выявление аномалий в транзакциях. Здесь ИИ работает в реальном времени и принимает тысячи решений в секунду — ни один человек физически не может делать это с той же скоростью и точностью.</w:t>
-      </w:r>
-    </w:p>
-    <w:p/>
-    <w:p>
-      <w:r>
-        <w:t>Четвёртое — HR и рекрутинг. Первичный отбор резюме, анализ текучести кадров, прогнозирование выгорания сотрудников. Для компаний с тысячами сотрудников это экономия сотен часов работы рекрутеров ежемесячно.</w:t>
-      </w:r>
-    </w:p>
-    <w:p/>
-    <w:p>
-      <w:r>
-        <w:t>Общий принцип простой: ИИ приживается там, где задача повторяется миллионы раз и где можно чётко измерить результат.</w:t>
+        <w:t>Короткий ответ: там, где есть большой поток однотипных операций и высокая цена ошибки.</w:t>
+      </w:r>
+    </w:p>
+    <w:p/>
+    <w:p>
+      <w:r>
+        <w:t>Первой по масштабу внедрений идёт сфера клиентского сервиса. Чат-боты и голосовые ассистенты закрывают до 70–80% обращений без участия живого оператора. Банки, телекомы, ретейлеры — все, у кого колл-центр стоит в год сотни миллионов рублей, уже там.</w:t>
+      </w:r>
+    </w:p>
+    <w:p/>
+    <w:p>
+      <w:r>
+        <w:t>На втором месте производство и логистика. Предиктивное обслуживание оборудования позволяет ИИ анализировать вибрацию, температуру и нагрузку, предупреждая о поломке за несколько дней до того, как она произойдёт. На крупном заводе один незапланированный простой линии обходится в десятки миллионов рублей убытков.</w:t>
+      </w:r>
+    </w:p>
+    <w:p/>
+    <w:p>
+      <w:r>
+        <w:t>Третья область — финансы и безопасность. Антифрод-системы, кредитный скоринг, выявление аномалий в транзакциях. ИИ работает здесь в реальном времени и принимает тысячи решений в секунду, что физически недоступно ни одному человеку.</w:t>
+      </w:r>
+    </w:p>
+    <w:p/>
+    <w:p>
+      <w:r>
+        <w:t>Четвёртое направление — HR и рекрутинг. Первичный отбор резюме, анализ текучести кадров, прогнозирование выгорания сотрудников. Для компаний с тысячами людей это экономия сотен часов работы рекрутеров ежемесячно.</w:t>
+      </w:r>
+    </w:p>
+    <w:p/>
+    <w:p>
+      <w:r>
+        <w:t>Общий принцип прост. ИИ приживается там, где задача повторяется миллионы раз и где можно чётко измерить результат.</w:t>
       </w:r>
     </w:p>
     <w:p/>
@@ -66,25 +66,25 @@
     <w:p/>
     <w:p>
       <w:r>
-        <w:t>Экономия бывает двух видов: прямая — когда убирают людей или процессы, и косвенная — когда снижают потери.</w:t>
-      </w:r>
-    </w:p>
-    <w:p/>
-    <w:p>
-      <w:r>
-        <w:t>Прямая экономия. Сбербанк сократил время обработки кредитных заявок с нескольких дней до минут после внедрения ИИ-скоринга. X5 Group использует ИИ для управления остатками на складах — это снижает списание товаров с истёкшим сроком на 15–20%. РЖД применяет предиктивную аналитику для обслуживания локомотивов: сокращение внеплановых ремонтов на треть при парке в тысячи единиц техники — это миллиарды рублей в год.</w:t>
-      </w:r>
-    </w:p>
-    <w:p/>
-    <w:p>
-      <w:r>
-        <w:t>Косвенная экономия — через снижение потерь. Страховые компании с помощью ИИ выявляют мошеннические выплаты, которые раньше проходили незамеченными. По оценкам страхового рынка, потери от мошенничества составляют 10–15% от всех выплат — ИИ перекрывает значительную их часть.</w:t>
-      </w:r>
-    </w:p>
-    <w:p/>
-    <w:p>
-      <w:r>
-        <w:t>Важный момент: самые впечатляющие кейсы — там, где ИИ не заменяет человека, а снимает с него рутину, позволяя сосредоточиться на задачах, где нужен реальный интеллект. Оператор колл-центра, которому ИИ уже подготовил историю клиента и вероятную причину звонка, решает проблему быстрее и закрывает больше обращений за смену.</w:t>
+        <w:t>Экономия бывает двух видов: прямая, когда убирают людей или процессы, и косвенная, когда снижают потери.</w:t>
+      </w:r>
+    </w:p>
+    <w:p/>
+    <w:p>
+      <w:r>
+        <w:t>По части прямой экономии Сбербанк сократил время обработки кредитных заявок с нескольких дней до минут после внедрения ИИ-скоринга. X5 Group использует ИИ для управления остатками на складах, что снижает списание товаров с истёкшим сроком на 15–20%. РЖД применяет предиктивную аналитику для обслуживания локомотивов: сокращение внеплановых ремонтов на треть при парке в тысячи единиц техники означает миллиарды рублей в год.</w:t>
+      </w:r>
+    </w:p>
+    <w:p/>
+    <w:p>
+      <w:r>
+        <w:t>Косвенная экономия происходит через снижение потерь. Страховые компании с помощью ИИ выявляют мошеннические выплаты, которые раньше проходили незамеченными. По оценкам страхового рынка потери от мошенничества составляют 10–15% от всех выплат, и ИИ перекрывает значительную их часть.</w:t>
+      </w:r>
+    </w:p>
+    <w:p/>
+    <w:p>
+      <w:r>
+        <w:t>Самые впечатляющие кейсы при этом не там, где ИИ заменяет человека, а там, где снимает с него рутину и позволяет сосредоточиться на задачах, требующих настоящего суждения. Оператор колл-центра, которому ИИ уже подготовил историю клиента и вероятную причину звонка, решает проблему быстрее и закрывает больше обращений за смену.</w:t>
       </w:r>
     </w:p>
     <w:p/>
@@ -97,31 +97,31 @@
     <w:p/>
     <w:p>
       <w:r>
-        <w:t>Это случается чаще, чем принято признавать публично. Есть несколько типичных причин.</w:t>
-      </w:r>
-    </w:p>
-    <w:p/>
-    <w:p>
-      <w:r>
-        <w:t>Проблема первая — мусорные данные. ИИ обучается на исторических данных компании. Если данные неполные, несогласованные или устаревшие — модель воспроизводит ошибки прошлого с высокой точностью. Один крупный ретейлер потратил год на внедрение системы прогнозирования спроса, которая давала худшие результаты, чем Excel-таблицы менеджеров, — потому что данные из разных филиалов вносились по разным правилам.</w:t>
-      </w:r>
-    </w:p>
-    <w:p/>
-    <w:p>
-      <w:r>
-        <w:t>Проблема вторая — внедрение ради галочки. Компания покупает дорогое решение, чтобы отчитаться перед советом директоров о цифровизации. Систему внедряют, но под неё не перестраивают процессы. Люди работают по-старому, параллельно заполняя новую систему — KPI не меняются, эффект нулевой.</w:t>
-      </w:r>
-    </w:p>
-    <w:p/>
-    <w:p>
-      <w:r>
-        <w:t>Проблема третья — сопротивление сотрудников. Особенно острое там, где ИИ воспринимается как инструмент контроля или угроза рабочим местам. Если команда саботирует новую систему или вносит в неё недостоверные данные — она никогда не заработает правильно.</w:t>
-      </w:r>
-    </w:p>
-    <w:p/>
-    <w:p>
-      <w:r>
-        <w:t>Как избежать. Начинать с аудита данных, а не с выбора вендора. Ставить конкретную измеримую задачу: не внедрить ИИ, а снизить время обработки заявки с 3 дней до 4 часов. Пилотировать на одном подразделении, считать результат, масштабировать только то, что доказало эффективность. И обязательно объяснять сотрудникам, что именно меняется и зачем.</w:t>
+        <w:t>Это случается чаще, чем принято признавать публично.</w:t>
+      </w:r>
+    </w:p>
+    <w:p/>
+    <w:p>
+      <w:r>
+        <w:t>Первая типичная причина — некачественные данные. ИИ обучается на исторических данных компании, и если они неполные, несогласованные или устаревшие, модель воспроизводит ошибки прошлого с высокой точностью. Один крупный ретейлер потратил год на внедрение системы прогнозирования спроса, которая давала худшие результаты, чем Excel-таблицы менеджеров, потому что данные из разных филиалов вносились по разным правилам.</w:t>
+      </w:r>
+    </w:p>
+    <w:p/>
+    <w:p>
+      <w:r>
+        <w:t>Вторая причина — внедрение ради отчётности. Компания покупает дорогое решение, чтобы отчитаться перед советом директоров о цифровизации. Систему внедряют, но под неё не перестраивают процессы. Люди работают по-старому, параллельно заполняя новую систему, KPI не меняются, эффект нулевой.</w:t>
+      </w:r>
+    </w:p>
+    <w:p/>
+    <w:p>
+      <w:r>
+        <w:t>Третья причина — сопротивление сотрудников. Оно особенно острое там, где ИИ воспринимается как инструмент контроля или угроза рабочим местам. Если команда саботирует новую систему или вносит в неё недостоверные данные, она никогда не заработает правильно.</w:t>
+      </w:r>
+    </w:p>
+    <w:p/>
+    <w:p>
+      <w:r>
+        <w:t>Как избежать этих ошибок. Начинать с аудита данных, а не с выбора вендора. Ставить конкретную измеримую задачу: не внедрить ИИ, а снизить время обработки заявки с трёх дней до четырёх часов. Пилотировать на одном подразделении, считать результат, масштабировать только то, что доказало эффективность. И обязательно объяснять сотрудникам, что именно меняется и зачем.</w:t>
       </w:r>
     </w:p>
     <w:p/>
@@ -134,25 +134,25 @@
     <w:p/>
     <w:p>
       <w:r>
-        <w:t>Ключевое слово — новые. Речь не о том, чтобы быстрее делать то, что раньше делали медленно. Речь о задачах, которые раньше были физически невозможны.</w:t>
-      </w:r>
-    </w:p>
-    <w:p/>
-    <w:p>
-      <w:r>
-        <w:t>Анализ неструктурированных данных. Раньше компании работали с тем, что можно посчитать: продажи, клики, транзакции. Теперь ИИ обрабатывает отзывы клиентов, звонки в колл-центр, переписку в чатах, новости о конкурентах — и извлекает из этого закономерности. Производитель потребительских товаров может узнать, что покупатели в конкретном регионе недовольны упаковкой, раньше, чем это отразится в падении продаж.</w:t>
-      </w:r>
-    </w:p>
-    <w:p/>
-    <w:p>
-      <w:r>
-        <w:t>Персонализация в масштабе. Раньше персонализация была привилегией премиум-сегмента. Сейчас банк с 10 миллионами клиентов может предлагать каждому продукт, рассчитанный именно под его финансовое поведение — и делать это в реальном времени.</w:t>
-      </w:r>
-    </w:p>
-    <w:p/>
-    <w:p>
-      <w:r>
-        <w:t>Прогнозирование, а не реакция. Традиционная аналитика отвечает на вопрос «что произошло». ИИ отвечает на вопрос «что произойдёт». Для конкурентоспособности это принципиальная разница: компания, которая предвидит изменение спроса за 3 месяца, успевает перестроить производство. Компания, которая реагирует по факту — теряет рынок.</w:t>
+        <w:t>Ключевое слово здесь — новые. Речь не о том, чтобы быстрее делать то, что раньше делали медленно. Речь о задачах, которые раньше были физически невозможны.</w:t>
+      </w:r>
+    </w:p>
+    <w:p/>
+    <w:p>
+      <w:r>
+        <w:t>Один из главных сдвигов — работа с неструктурированными данными. Раньше компании работали с тем, что можно посчитать: продажи, клики, транзакции. Теперь ИИ обрабатывает отзывы клиентов, звонки в колл-центр, переписку в чатах, новости о конкурентах и извлекает из этого закономерности. Производитель потребительских товаров может узнать, что покупатели в конкретном регионе недовольны упаковкой, раньше, чем это отразится в падении продаж.</w:t>
+      </w:r>
+    </w:p>
+    <w:p/>
+    <w:p>
+      <w:r>
+        <w:t>Другой важный сдвиг — персонализация в масштабе. Раньше это была привилегия премиум-сегмента. Сейчас банк с 10 миллионами клиентов может предлагать каждому продукт под его финансовое поведение и делать это в реальном времени.</w:t>
+      </w:r>
+    </w:p>
+    <w:p/>
+    <w:p>
+      <w:r>
+        <w:t>Третий сдвиг — переход от реакции к прогнозированию. Традиционная аналитика отвечает на вопрос о том, что произошло. ИИ отвечает на вопрос о том, что произойдёт. Компания, которая предвидит изменение спроса за три месяца, успевает перестроить производство. Компания, реагирующая по факту, теряет рынок.</w:t>
       </w:r>
     </w:p>
     <w:p/>
@@ -165,31 +165,31 @@
     <w:p/>
     <w:p>
       <w:r>
-        <w:t>Топ-менеджер крупной компании принимает десятки решений в день, каждое из которых опирается на неполную информацию. ИИ не принимает решения за него — но меняет качество информации, с которой он работает.</w:t>
-      </w:r>
-    </w:p>
-    <w:p/>
-    <w:p>
-      <w:r>
-        <w:t>Дашборды реального времени. Руководитель видит не отчёт за прошлый месяц, а текущее состояние бизнеса: выручка, отток клиентов, загрузка производства, отклонения от плана — прямо сейчас. Аномалии система выделяет автоматически, не нужно искать иголку в стоге данных.</w:t>
-      </w:r>
-    </w:p>
-    <w:p/>
-    <w:p>
-      <w:r>
-        <w:t>Сценарное моделирование. Что будет, если мы поднимем цену на 10%? Как изменится маржа, если логистика подорожает? Раньше такой анализ занимал недели работы аналитиков. Сейчас — минуты. Это позволяет проверять больше гипотез и принимать решения с большей уверенностью.</w:t>
-      </w:r>
-    </w:p>
-    <w:p/>
-    <w:p>
-      <w:r>
-        <w:t>Суммаризация и фильтрация информации. Генеральный директор крупной компании физически не может прочитать все отчёты, новости, аналитику, которая к нему поступает. ИИ-ассистент фильтрует поток, выделяет существенное и формулирует краткое резюме с ключевыми выводами. Это не про ленность — это про то, чтобы концентрация внимания руководителя тратилась на решения, а не на поиск информации.</w:t>
-      </w:r>
-    </w:p>
-    <w:p/>
-    <w:p>
-      <w:r>
-        <w:t>Главный принцип: ИИ должен сокращать время от вопроса до ответа, не создавая новый слой сложности.</w:t>
+        <w:t>Топ-менеджер крупной компании принимает десятки решений в день, каждое из которых опирается на неполную информацию. ИИ не принимает решения за него, но меняет качество информации, с которой он работает.</w:t>
+      </w:r>
+    </w:p>
+    <w:p/>
+    <w:p>
+      <w:r>
+        <w:t>Дашборды реального времени дают руководителю не отчёт за прошлый месяц, а текущее состояние бизнеса прямо сейчас: выручка, отток клиентов, загрузка производства, отклонения от плана. Аномалии система выделяет автоматически, и не нужно искать иголку в стоге данных.</w:t>
+      </w:r>
+    </w:p>
+    <w:p/>
+    <w:p>
+      <w:r>
+        <w:t>Сценарное моделирование позволяет проверять гипотезы за минуты вместо недель. Анализ того, что произойдёт при росте цены на 10% или при удорожании логистики, раньше требовал дней работы аналитиков. Это позволяет принимать решения с большей уверенностью и скоростью.</w:t>
+      </w:r>
+    </w:p>
+    <w:p/>
+    <w:p>
+      <w:r>
+        <w:t>Фильтрация информационного потока закрывает ещё одну важную проблему. Генеральный директор крупной компании физически не может прочитать все отчёты, новости и аналитику, которые к нему поступают. ИИ-ассистент фильтрует поток, выделяет существенное и формулирует краткое резюме с ключевыми выводами. Это про то, чтобы внимание руководителя тратилось на решения, а не на поиск информации.</w:t>
+      </w:r>
+    </w:p>
+    <w:p/>
+    <w:p>
+      <w:r>
+        <w:t>Главный принцип остаётся простым. ИИ должен сокращать время от вопроса до ответа и не создавать новый слой сложности.</w:t>
       </w:r>
     </w:p>
     <w:p/>
@@ -208,31 +208,31 @@
     <w:p/>
     <w:p>
       <w:r>
-        <w:t>Дискриминация алгоритмов. ИИ-модель, обученная на исторических данных, воспроизводит исторические предубеждения. Банки в ряде стран столкнулись с судебными исками за кредитные отказы, которые непропорционально часто получали представители определённых групп — не потому что это было целью, а потому что так выглядели исторические данные. В России регуляторное давление пока мягче, но международная практика формирует стандарты, которые придут и сюда.</w:t>
-      </w:r>
-    </w:p>
-    <w:p/>
-    <w:p>
-      <w:r>
-        <w:t>Персональные данные. 152-ФЗ и GDPR для международных компаний — это не формальности. ИИ-системы, обучающиеся на клиентских данных, должны соответствовать требованиям законодательства. Нарушение — штрафы, предписания, приостановка работы систем.</w:t>
-      </w:r>
-    </w:p>
-    <w:p/>
-    <w:p>
-      <w:r>
-        <w:t>Объяснимость решений. Если ИИ отказал клиенту в кредите или уволил сотрудника по результатам оценки — компания должна быть готова объяснить, почему. «Алгоритм так решил» не является юридически приемлемым ответом в большинстве юрисдикций. Это требует использования объяснимых моделей или дополнительного слоя интерпретации.</w:t>
-      </w:r>
-    </w:p>
-    <w:p/>
-    <w:p>
-      <w:r>
-        <w:t>Что это значит на практике. Перед внедрением ИИ в любой чувствительной области — кредитование, HR, безопасность — необходим аудит модели на предмет предвзятости. Нужны чёткие политики хранения и использования данных. И нужен человек в контуре принятия решений там, где цена ошибки высока.</w:t>
-      </w:r>
-    </w:p>
-    <w:p/>
-    <w:p>
-      <w:r>
-        <w:t>Компании, которые встраивают этику в архитектуру своих ИИ-систем с самого начала, тратят на это меньше, чем те, кто исправляет последствия потом.</w:t>
+        <w:t>Первый риск — дискриминация алгоритмов. ИИ-модель, обученная на исторических данных, воспроизводит исторические предубеждения. Банки в ряде стран столкнулись с судебными исками за кредитные отказы, которые непропорционально часто получали представители определённых групп. Происходило это не потому, что такова была цель, а потому что так выглядели исторические данные. В России регуляторное давление пока мягче, но международная практика формирует стандарты, которые придут и сюда.</w:t>
+      </w:r>
+    </w:p>
+    <w:p/>
+    <w:p>
+      <w:r>
+        <w:t>Второй риск — нарушение законодательства о персональных данных. 152-ФЗ и GDPR для международных компаний это не формальности. ИИ-системы, обучающиеся на клиентских данных, должны соответствовать требованиям закона, а нарушение означает штрафы, предписания и приостановку работы систем.</w:t>
+      </w:r>
+    </w:p>
+    <w:p/>
+    <w:p>
+      <w:r>
+        <w:t>Третий риск — необъяснимость решений. Если ИИ отказал клиенту в кредите или уволил сотрудника по результатам оценки, компания должна быть готова объяснить почему. Ссылка на алгоритм не является юридически приемлемым ответом в большинстве юрисдикций. Это требует использования объяснимых моделей или дополнительного слоя интерпретации.</w:t>
+      </w:r>
+    </w:p>
+    <w:p/>
+    <w:p>
+      <w:r>
+        <w:t>На практике это означает следующее. Перед внедрением ИИ в любой чувствительной области необходим аудит модели на предмет предвзятости. Нужны чёткие политики хранения и использования данных. И нужен человек в контуре принятия решений там, где цена ошибки высока.</w:t>
+      </w:r>
+    </w:p>
+    <w:p/>
+    <w:p>
+      <w:r>
+        <w:t>Компании, которые встраивают этику в архитектуру своих ИИ-систем с самого начала, тратят на это значительно меньше, чем те, кто исправляет последствия потом.</w:t>
       </w:r>
     </w:p>
     <w:p/>
@@ -654,7 +654,7 @@
     <w:link w:val="10"/>
     <w:uiPriority w:val="9"/>
     <w:qFormat/>
-    <w:rsid w:val="00436E07"/>
+    <w:rsid w:val="00573F19"/>
     <w:pPr>
       <w:keepNext/>
       <w:keepLines/>
@@ -677,7 +677,7 @@
     <w:semiHidden/>
     <w:unhideWhenUsed/>
     <w:qFormat/>
-    <w:rsid w:val="00436E07"/>
+    <w:rsid w:val="00573F19"/>
     <w:pPr>
       <w:keepNext/>
       <w:keepLines/>
@@ -700,7 +700,7 @@
     <w:semiHidden/>
     <w:unhideWhenUsed/>
     <w:qFormat/>
-    <w:rsid w:val="00436E07"/>
+    <w:rsid w:val="00573F19"/>
     <w:pPr>
       <w:keepNext/>
       <w:keepLines/>
@@ -723,7 +723,7 @@
     <w:semiHidden/>
     <w:unhideWhenUsed/>
     <w:qFormat/>
-    <w:rsid w:val="00436E07"/>
+    <w:rsid w:val="00573F19"/>
     <w:pPr>
       <w:keepNext/>
       <w:keepLines/>
@@ -746,7 +746,7 @@
     <w:semiHidden/>
     <w:unhideWhenUsed/>
     <w:qFormat/>
-    <w:rsid w:val="00436E07"/>
+    <w:rsid w:val="00573F19"/>
     <w:pPr>
       <w:keepNext/>
       <w:keepLines/>
@@ -767,7 +767,7 @@
     <w:semiHidden/>
     <w:unhideWhenUsed/>
     <w:qFormat/>
-    <w:rsid w:val="00436E07"/>
+    <w:rsid w:val="00573F19"/>
     <w:pPr>
       <w:keepNext/>
       <w:keepLines/>
@@ -790,7 +790,7 @@
     <w:semiHidden/>
     <w:unhideWhenUsed/>
     <w:qFormat/>
-    <w:rsid w:val="00436E07"/>
+    <w:rsid w:val="00573F19"/>
     <w:pPr>
       <w:keepNext/>
       <w:keepLines/>
@@ -811,7 +811,7 @@
     <w:semiHidden/>
     <w:unhideWhenUsed/>
     <w:qFormat/>
-    <w:rsid w:val="00436E07"/>
+    <w:rsid w:val="00573F19"/>
     <w:pPr>
       <w:keepNext/>
       <w:keepLines/>
@@ -834,7 +834,7 @@
     <w:semiHidden/>
     <w:unhideWhenUsed/>
     <w:qFormat/>
-    <w:rsid w:val="00436E07"/>
+    <w:rsid w:val="00573F19"/>
     <w:pPr>
       <w:keepNext/>
       <w:keepLines/>
@@ -878,7 +878,7 @@
     <w:basedOn w:val="a0"/>
     <w:link w:val="1"/>
     <w:uiPriority w:val="9"/>
-    <w:rsid w:val="00436E07"/>
+    <w:rsid w:val="00573F19"/>
     <w:rPr>
       <w:rFonts w:asciiTheme="majorHAnsi" w:eastAsiaTheme="majorEastAsia" w:hAnsiTheme="majorHAnsi" w:cstheme="majorBidi"/>
       <w:color w:val="0F4761" w:themeColor="accent1" w:themeShade="BF"/>
@@ -892,7 +892,7 @@
     <w:link w:val="2"/>
     <w:uiPriority w:val="9"/>
     <w:semiHidden/>
-    <w:rsid w:val="00436E07"/>
+    <w:rsid w:val="00573F19"/>
     <w:rPr>
       <w:rFonts w:asciiTheme="majorHAnsi" w:eastAsiaTheme="majorEastAsia" w:hAnsiTheme="majorHAnsi" w:cstheme="majorBidi"/>
       <w:color w:val="0F4761" w:themeColor="accent1" w:themeShade="BF"/>
@@ -906,7 +906,7 @@
     <w:link w:val="3"/>
     <w:uiPriority w:val="9"/>
     <w:semiHidden/>
-    <w:rsid w:val="00436E07"/>
+    <w:rsid w:val="00573F19"/>
     <w:rPr>
       <w:rFonts w:eastAsiaTheme="majorEastAsia" w:cstheme="majorBidi"/>
       <w:color w:val="0F4761" w:themeColor="accent1" w:themeShade="BF"/>
@@ -920,7 +920,7 @@
     <w:link w:val="4"/>
     <w:uiPriority w:val="9"/>
     <w:semiHidden/>
-    <w:rsid w:val="00436E07"/>
+    <w:rsid w:val="00573F19"/>
     <w:rPr>
       <w:rFonts w:eastAsiaTheme="majorEastAsia" w:cstheme="majorBidi"/>
       <w:i/>
@@ -934,7 +934,7 @@
     <w:link w:val="5"/>
     <w:uiPriority w:val="9"/>
     <w:semiHidden/>
-    <w:rsid w:val="00436E07"/>
+    <w:rsid w:val="00573F19"/>
     <w:rPr>
       <w:rFonts w:eastAsiaTheme="majorEastAsia" w:cstheme="majorBidi"/>
       <w:color w:val="0F4761" w:themeColor="accent1" w:themeShade="BF"/>
@@ -946,7 +946,7 @@
     <w:link w:val="6"/>
     <w:uiPriority w:val="9"/>
     <w:semiHidden/>
-    <w:rsid w:val="00436E07"/>
+    <w:rsid w:val="00573F19"/>
     <w:rPr>
       <w:rFonts w:eastAsiaTheme="majorEastAsia" w:cstheme="majorBidi"/>
       <w:i/>
@@ -960,7 +960,7 @@
     <w:link w:val="7"/>
     <w:uiPriority w:val="9"/>
     <w:semiHidden/>
-    <w:rsid w:val="00436E07"/>
+    <w:rsid w:val="00573F19"/>
     <w:rPr>
       <w:rFonts w:eastAsiaTheme="majorEastAsia" w:cstheme="majorBidi"/>
       <w:color w:val="595959" w:themeColor="text1" w:themeTint="A6"/>
@@ -972,7 +972,7 @@
     <w:link w:val="8"/>
     <w:uiPriority w:val="9"/>
     <w:semiHidden/>
-    <w:rsid w:val="00436E07"/>
+    <w:rsid w:val="00573F19"/>
     <w:rPr>
       <w:rFonts w:eastAsiaTheme="majorEastAsia" w:cstheme="majorBidi"/>
       <w:i/>
@@ -986,7 +986,7 @@
     <w:link w:val="9"/>
     <w:uiPriority w:val="9"/>
     <w:semiHidden/>
-    <w:rsid w:val="00436E07"/>
+    <w:rsid w:val="00573F19"/>
     <w:rPr>
       <w:rFonts w:eastAsiaTheme="majorEastAsia" w:cstheme="majorBidi"/>
       <w:color w:val="272727" w:themeColor="text1" w:themeTint="D8"/>
@@ -999,7 +999,7 @@
     <w:link w:val="a4"/>
     <w:uiPriority w:val="10"/>
     <w:qFormat/>
-    <w:rsid w:val="00436E07"/>
+    <w:rsid w:val="00573F19"/>
     <w:pPr>
       <w:spacing w:after="80" w:line="240" w:lineRule="auto"/>
       <w:contextualSpacing/>
@@ -1017,7 +1017,7 @@
     <w:basedOn w:val="a0"/>
     <w:link w:val="a3"/>
     <w:uiPriority w:val="10"/>
-    <w:rsid w:val="00436E07"/>
+    <w:rsid w:val="00573F19"/>
     <w:rPr>
       <w:rFonts w:asciiTheme="majorHAnsi" w:eastAsiaTheme="majorEastAsia" w:hAnsiTheme="majorHAnsi" w:cstheme="majorBidi"/>
       <w:spacing w:val="-10"/>
@@ -1033,7 +1033,7 @@
     <w:link w:val="a6"/>
     <w:uiPriority w:val="11"/>
     <w:qFormat/>
-    <w:rsid w:val="00436E07"/>
+    <w:rsid w:val="00573F19"/>
     <w:pPr>
       <w:numPr>
         <w:ilvl w:val="1"/>
@@ -1052,7 +1052,7 @@
     <w:basedOn w:val="a0"/>
     <w:link w:val="a5"/>
     <w:uiPriority w:val="11"/>
-    <w:rsid w:val="00436E07"/>
+    <w:rsid w:val="00573F19"/>
     <w:rPr>
       <w:rFonts w:eastAsiaTheme="majorEastAsia" w:cstheme="majorBidi"/>
       <w:color w:val="595959" w:themeColor="text1" w:themeTint="A6"/>
@@ -1068,7 +1068,7 @@
     <w:link w:val="22"/>
     <w:uiPriority w:val="29"/>
     <w:qFormat/>
-    <w:rsid w:val="00436E07"/>
+    <w:rsid w:val="00573F19"/>
     <w:pPr>
       <w:spacing w:before="160"/>
       <w:jc w:val="center"/>
@@ -1084,7 +1084,7 @@
     <w:basedOn w:val="a0"/>
     <w:link w:val="21"/>
     <w:uiPriority w:val="29"/>
-    <w:rsid w:val="00436E07"/>
+    <w:rsid w:val="00573F19"/>
     <w:rPr>
       <w:i/>
       <w:iCs/>
@@ -1096,7 +1096,7 @@
     <w:basedOn w:val="a"/>
     <w:uiPriority w:val="34"/>
     <w:qFormat/>
-    <w:rsid w:val="00436E07"/>
+    <w:rsid w:val="00573F19"/>
     <w:pPr>
       <w:ind w:left="720"/>
       <w:contextualSpacing/>
@@ -1107,7 +1107,7 @@
     <w:basedOn w:val="a0"/>
     <w:uiPriority w:val="21"/>
     <w:qFormat/>
-    <w:rsid w:val="00436E07"/>
+    <w:rsid w:val="00573F19"/>
     <w:rPr>
       <w:i/>
       <w:iCs/>
@@ -1121,7 +1121,7 @@
     <w:link w:val="aa"/>
     <w:uiPriority w:val="30"/>
     <w:qFormat/>
-    <w:rsid w:val="00436E07"/>
+    <w:rsid w:val="00573F19"/>
     <w:pPr>
       <w:pBdr>
         <w:top w:val="single" w:sz="4" w:space="10" w:color="0F4761" w:themeColor="accent1" w:themeShade="BF"/>
@@ -1142,7 +1142,7 @@
     <w:basedOn w:val="a0"/>
     <w:link w:val="a9"/>
     <w:uiPriority w:val="30"/>
-    <w:rsid w:val="00436E07"/>
+    <w:rsid w:val="00573F19"/>
     <w:rPr>
       <w:i/>
       <w:iCs/>
@@ -1154,7 +1154,7 @@
     <w:basedOn w:val="a0"/>
     <w:uiPriority w:val="32"/>
     <w:qFormat/>
-    <w:rsid w:val="00436E07"/>
+    <w:rsid w:val="00573F19"/>
     <w:rPr>
       <w:b/>
       <w:bCs/>

</xml_diff>

<commit_message>
Remove all dashes and hyphens from both articles, re-export docx
</commit_message>
<xml_diff>
--- a/ответы/тинькофф-журнал-ии-в-крупных-компаниях.docx
+++ b/ответы/тинькофф-журнал-ии-в-крупных-компаниях.docx
@@ -29,19 +29,19 @@
     <w:p/>
     <w:p>
       <w:r>
-        <w:t>Первой по масштабу внедрений идёт сфера клиентского сервиса. Чат-боты и голосовые ассистенты закрывают до 70–80% обращений без участия живого оператора. Банки, телекомы, ретейлеры — все, у кого колл-центр стоит в год сотни миллионов рублей, уже там.</w:t>
-      </w:r>
-    </w:p>
-    <w:p/>
-    <w:p>
-      <w:r>
-        <w:t>На втором месте производство и логистика. Предиктивное обслуживание оборудования позволяет ИИ анализировать вибрацию, температуру и нагрузку, предупреждая о поломке за несколько дней до того, как она произойдёт. На крупном заводе один незапланированный простой линии обходится в десятки миллионов рублей убытков.</w:t>
-      </w:r>
-    </w:p>
-    <w:p/>
-    <w:p>
-      <w:r>
-        <w:t>Третья область — финансы и безопасность. Антифрод-системы, кредитный скоринг, выявление аномалий в транзакциях. ИИ работает здесь в реальном времени и принимает тысячи решений в секунду, что физически недоступно ни одному человеку.</w:t>
+        <w:t>Первой по масштабу внедрений идёт сфера клиентского сервиса. Боты и голосовые ассистенты закрывают от 70 до 80 процентов обращений без участия живого оператора. Банки, телекомы, ретейлеры, то есть все, у кого служба поддержки стоит в год сотни миллионов рублей, уже там.</w:t>
+      </w:r>
+    </w:p>
+    <w:p/>
+    <w:p>
+      <w:r>
+        <w:t>На втором месте производство и логистика. Предиктивное обслуживание оборудования позволяет системе анализировать вибрацию, температуру и нагрузку, предупреждая о поломке за несколько дней до того, как она произойдёт. На крупном заводе один незапланированный простой линии обходится в десятки миллионов рублей убытков.</w:t>
+      </w:r>
+    </w:p>
+    <w:p/>
+    <w:p>
+      <w:r>
+        <w:t>Третья область — финансы и безопасность. Системы защиты от мошенничества, кредитный скоринг, выявление аномалий в транзакциях. Искусственный интеллект работает здесь в реальном времени и принимает тысячи решений в секунду, что физически недоступно ни одному человеку.</w:t>
       </w:r>
     </w:p>
     <w:p/>
@@ -53,7 +53,7 @@
     <w:p/>
     <w:p>
       <w:r>
-        <w:t>Общий принцип прост. ИИ приживается там, где задача повторяется миллионы раз и где можно чётко измерить результат.</w:t>
+        <w:t>Общий принцип прост. Искусственный интеллект приживается там, где задача повторяется миллионы раз и где можно чётко измерить результат.</w:t>
       </w:r>
     </w:p>
     <w:p/>
@@ -72,19 +72,19 @@
     <w:p/>
     <w:p>
       <w:r>
-        <w:t>По части прямой экономии Сбербанк сократил время обработки кредитных заявок с нескольких дней до минут после внедрения ИИ-скоринга. X5 Group использует ИИ для управления остатками на складах, что снижает списание товаров с истёкшим сроком на 15–20%. РЖД применяет предиктивную аналитику для обслуживания локомотивов: сокращение внеплановых ремонтов на треть при парке в тысячи единиц техники означает миллиарды рублей в год.</w:t>
-      </w:r>
-    </w:p>
-    <w:p/>
-    <w:p>
-      <w:r>
-        <w:t>Косвенная экономия происходит через снижение потерь. Страховые компании с помощью ИИ выявляют мошеннические выплаты, которые раньше проходили незамеченными. По оценкам страхового рынка потери от мошенничества составляют 10–15% от всех выплат, и ИИ перекрывает значительную их часть.</w:t>
-      </w:r>
-    </w:p>
-    <w:p/>
-    <w:p>
-      <w:r>
-        <w:t>Самые впечатляющие кейсы при этом не там, где ИИ заменяет человека, а там, где снимает с него рутину и позволяет сосредоточиться на задачах, требующих настоящего суждения. Оператор колл-центра, которому ИИ уже подготовил историю клиента и вероятную причину звонка, решает проблему быстрее и закрывает больше обращений за смену.</w:t>
+        <w:t>По части прямой экономии Сбербанк сократил время обработки кредитных заявок с нескольких дней до минут после внедрения скоринга на основе искусственного интеллекта. X5 Group использует ИИ для управления остатками на складах, что снижает списание товаров с истёкшим сроком примерно на 15 до 20 процентов. РЖД применяет предиктивную аналитику для обслуживания локомотивов, и сокращение внеплановых ремонтов на треть при парке в тысячи единиц техники означает миллиарды рублей в год.</w:t>
+      </w:r>
+    </w:p>
+    <w:p/>
+    <w:p>
+      <w:r>
+        <w:t>Косвенная экономия происходит через снижение потерь. Страховые компании с помощью ИИ выявляют мошеннические выплаты, которые раньше проходили незамеченными. По оценкам страхового рынка потери от мошенничества составляют от 10 до 15 процентов от всех выплат, и искусственный интеллект перекрывает значительную их часть.</w:t>
+      </w:r>
+    </w:p>
+    <w:p/>
+    <w:p>
+      <w:r>
+        <w:t>Самые впечатляющие кейсы при этом не там, где ИИ заменяет человека, а там, где снимает с него рутину и позволяет сосредоточиться на задачах, требующих настоящего суждения. Оператор службы поддержки, которому система уже подготовила историю клиента и вероятную причину звонка, решает проблему быстрее и закрывает больше обращений за смену.</w:t>
       </w:r>
     </w:p>
     <w:p/>
@@ -103,7 +103,7 @@
     <w:p/>
     <w:p>
       <w:r>
-        <w:t>Первая типичная причина — некачественные данные. ИИ обучается на исторических данных компании, и если они неполные, несогласованные или устаревшие, модель воспроизводит ошибки прошлого с высокой точностью. Один крупный ретейлер потратил год на внедрение системы прогнозирования спроса, которая давала худшие результаты, чем Excel-таблицы менеджеров, потому что данные из разных филиалов вносились по разным правилам.</w:t>
+        <w:t>Первая типичная причина — некачественные данные. Искусственный интеллект обучается на исторических данных компании, и если они неполные, несогласованные или устаревшие, модель воспроизводит ошибки прошлого с высокой точностью. Один крупный ретейлер потратил год на внедрение системы прогнозирования спроса, которая давала худшие результаты, чем Excel-таблицы менеджеров, потому что данные из разных филиалов вносились по разным правилам.</w:t>
       </w:r>
     </w:p>
     <w:p/>
@@ -140,7 +140,7 @@
     <w:p/>
     <w:p>
       <w:r>
-        <w:t>Один из главных сдвигов — работа с неструктурированными данными. Раньше компании работали с тем, что можно посчитать: продажи, клики, транзакции. Теперь ИИ обрабатывает отзывы клиентов, звонки в колл-центр, переписку в чатах, новости о конкурентах и извлекает из этого закономерности. Производитель потребительских товаров может узнать, что покупатели в конкретном регионе недовольны упаковкой, раньше, чем это отразится в падении продаж.</w:t>
+        <w:t>Один из главных сдвигов — работа с неструктурированными данными. Раньше компании работали с тем, что можно посчитать: продажи, клики, транзакции. Теперь искусственный интеллект обрабатывает отзывы клиентов, звонки в службу поддержки, переписку в чатах, новости о конкурентах и извлекает из этого закономерности. Производитель потребительских товаров может узнать, что покупатели в конкретном регионе недовольны упаковкой, раньше, чем это отразится в падении продаж.</w:t>
       </w:r>
     </w:p>
     <w:p/>
@@ -152,7 +152,7 @@
     <w:p/>
     <w:p>
       <w:r>
-        <w:t>Третий сдвиг — переход от реакции к прогнозированию. Традиционная аналитика отвечает на вопрос о том, что произошло. ИИ отвечает на вопрос о том, что произойдёт. Компания, которая предвидит изменение спроса за три месяца, успевает перестроить производство. Компания, реагирующая по факту, теряет рынок.</w:t>
+        <w:t>Третий сдвиг — переход от реакции к прогнозированию. Традиционная аналитика отвечает на вопрос о том, что произошло. Искусственный интеллект отвечает на вопрос о том, что произойдёт. Компания, которая предвидит изменение спроса за три месяца, успевает перестроить производство. Компания, реагирующая по факту, теряет рынок.</w:t>
       </w:r>
     </w:p>
     <w:p/>
@@ -165,7 +165,7 @@
     <w:p/>
     <w:p>
       <w:r>
-        <w:t>Топ-менеджер крупной компании принимает десятки решений в день, каждое из которых опирается на неполную информацию. ИИ не принимает решения за него, но меняет качество информации, с которой он работает.</w:t>
+        <w:t>Топ-менеджер крупной компании принимает десятки решений в день, каждое из которых опирается на неполную информацию. Искусственный интеллект не принимает решения за него, но меняет качество информации, с которой он работает.</w:t>
       </w:r>
     </w:p>
     <w:p/>
@@ -177,13 +177,13 @@
     <w:p/>
     <w:p>
       <w:r>
-        <w:t>Сценарное моделирование позволяет проверять гипотезы за минуты вместо недель. Анализ того, что произойдёт при росте цены на 10% или при удорожании логистики, раньше требовал дней работы аналитиков. Это позволяет принимать решения с большей уверенностью и скоростью.</w:t>
-      </w:r>
-    </w:p>
-    <w:p/>
-    <w:p>
-      <w:r>
-        <w:t>Фильтрация информационного потока закрывает ещё одну важную проблему. Генеральный директор крупной компании физически не может прочитать все отчёты, новости и аналитику, которые к нему поступают. ИИ-ассистент фильтрует поток, выделяет существенное и формулирует краткое резюме с ключевыми выводами. Это про то, чтобы внимание руководителя тратилось на решения, а не на поиск информации.</w:t>
+        <w:t>Сценарное моделирование позволяет проверять гипотезы за минуты вместо недель. Анализ того, что произойдёт при росте цены на 10 процентов или при удорожании логистики, раньше требовал дней работы аналитиков. Это позволяет принимать решения с большей уверенностью и скоростью.</w:t>
+      </w:r>
+    </w:p>
+    <w:p/>
+    <w:p>
+      <w:r>
+        <w:t>Фильтрация информационного потока закрывает ещё одну важную проблему. Генеральный директор крупной компании физически не может прочитать все отчёты, новости и аналитику, которые к нему поступают. Цифровой ассистент фильтрует поток, выделяет существенное и формулирует краткое резюме с ключевыми выводами. Это про то, чтобы внимание руководителя тратилось на решения, а не на поиск информации.</w:t>
       </w:r>
     </w:p>
     <w:p/>
@@ -196,43 +196,43 @@
     <w:p/>
     <w:p>
       <w:r>
-        <w:t>Этика и законы: на что нужно обращать внимание при внедрении ИИ в крупных компаниях?</w:t>
-      </w:r>
-    </w:p>
-    <w:p/>
-    <w:p>
-      <w:r>
-        <w:t>Это не абстрактная тема для корпоративных ESG-отчётов. Это реальные риски, которые уже стоили компаниям денег и репутации.</w:t>
-      </w:r>
-    </w:p>
-    <w:p/>
-    <w:p>
-      <w:r>
-        <w:t>Первый риск — дискриминация алгоритмов. ИИ-модель, обученная на исторических данных, воспроизводит исторические предубеждения. Банки в ряде стран столкнулись с судебными исками за кредитные отказы, которые непропорционально часто получали представители определённых групп. Происходило это не потому, что такова была цель, а потому что так выглядели исторические данные. В России регуляторное давление пока мягче, но международная практика формирует стандарты, которые придут и сюда.</w:t>
-      </w:r>
-    </w:p>
-    <w:p/>
-    <w:p>
-      <w:r>
-        <w:t>Второй риск — нарушение законодательства о персональных данных. 152-ФЗ и GDPR для международных компаний это не формальности. ИИ-системы, обучающиеся на клиентских данных, должны соответствовать требованиям закона, а нарушение означает штрафы, предписания и приостановку работы систем.</w:t>
-      </w:r>
-    </w:p>
-    <w:p/>
-    <w:p>
-      <w:r>
-        <w:t>Третий риск — необъяснимость решений. Если ИИ отказал клиенту в кредите или уволил сотрудника по результатам оценки, компания должна быть готова объяснить почему. Ссылка на алгоритм не является юридически приемлемым ответом в большинстве юрисдикций. Это требует использования объяснимых моделей или дополнительного слоя интерпретации.</w:t>
-      </w:r>
-    </w:p>
-    <w:p/>
-    <w:p>
-      <w:r>
-        <w:t>На практике это означает следующее. Перед внедрением ИИ в любой чувствительной области необходим аудит модели на предмет предвзятости. Нужны чёткие политики хранения и использования данных. И нужен человек в контуре принятия решений там, где цена ошибки высока.</w:t>
-      </w:r>
-    </w:p>
-    <w:p/>
-    <w:p>
-      <w:r>
-        <w:t>Компании, которые встраивают этику в архитектуру своих ИИ-систем с самого начала, тратят на это значительно меньше, чем те, кто исправляет последствия потом.</w:t>
+        <w:t>На что нужно обращать внимание в плане этики и законов при внедрении ИИ в крупных компаниях?</w:t>
+      </w:r>
+    </w:p>
+    <w:p/>
+    <w:p>
+      <w:r>
+        <w:t>Это не абстрактная тема для корпоративной отчётности. Это реальные риски, которые уже стоили компаниям денег и репутации.</w:t>
+      </w:r>
+    </w:p>
+    <w:p/>
+    <w:p>
+      <w:r>
+        <w:t>Первый риск — дискриминация алгоритмов. Модель, обученная на исторических данных, воспроизводит исторические предубеждения. Банки в ряде стран столкнулись с судебными исками за кредитные отказы, которые непропорционально часто получали представители определённых групп. Происходило это не потому, что такова была цель, а потому что так выглядели исторические данные. В России регуляторное давление пока мягче, но международная практика формирует стандарты, которые придут и сюда.</w:t>
+      </w:r>
+    </w:p>
+    <w:p/>
+    <w:p>
+      <w:r>
+        <w:t>Второй риск — нарушение законодательства о персональных данных. 152-ФЗ и GDPR для международных компаний это не формальности. Системы, обучающиеся на клиентских данных, должны соответствовать требованиям закона, а нарушение означает штрафы, предписания и приостановку работы.</w:t>
+      </w:r>
+    </w:p>
+    <w:p/>
+    <w:p>
+      <w:r>
+        <w:t>Третий риск — необъяснимость решений. Если система отказала клиенту в кредите или уволила сотрудника по результатам оценки, компания должна быть готова объяснить почему. Ссылка на алгоритм не является юридически приемлемым ответом в большинстве юрисдикций. Это требует использования объяснимых моделей или дополнительного слоя интерпретации.</w:t>
+      </w:r>
+    </w:p>
+    <w:p/>
+    <w:p>
+      <w:r>
+        <w:t>На практике это означает следующее. Перед внедрением в любой чувствительной области необходим аудит модели на предмет предвзятости. Нужны чёткие политики хранения и использования данных. И нужен человек в контуре принятия решений там, где цена ошибки высока.</w:t>
+      </w:r>
+    </w:p>
+    <w:p/>
+    <w:p>
+      <w:r>
+        <w:t>Компании, которые встраивают этику в архитектуру своих систем с самого начала, тратят на это значительно меньше, чем те, кто исправляет последствия потом.</w:t>
       </w:r>
     </w:p>
     <w:p/>
@@ -654,7 +654,7 @@
     <w:link w:val="10"/>
     <w:uiPriority w:val="9"/>
     <w:qFormat/>
-    <w:rsid w:val="00573F19"/>
+    <w:rsid w:val="00805316"/>
     <w:pPr>
       <w:keepNext/>
       <w:keepLines/>
@@ -677,7 +677,7 @@
     <w:semiHidden/>
     <w:unhideWhenUsed/>
     <w:qFormat/>
-    <w:rsid w:val="00573F19"/>
+    <w:rsid w:val="00805316"/>
     <w:pPr>
       <w:keepNext/>
       <w:keepLines/>
@@ -700,7 +700,7 @@
     <w:semiHidden/>
     <w:unhideWhenUsed/>
     <w:qFormat/>
-    <w:rsid w:val="00573F19"/>
+    <w:rsid w:val="00805316"/>
     <w:pPr>
       <w:keepNext/>
       <w:keepLines/>
@@ -723,7 +723,7 @@
     <w:semiHidden/>
     <w:unhideWhenUsed/>
     <w:qFormat/>
-    <w:rsid w:val="00573F19"/>
+    <w:rsid w:val="00805316"/>
     <w:pPr>
       <w:keepNext/>
       <w:keepLines/>
@@ -746,7 +746,7 @@
     <w:semiHidden/>
     <w:unhideWhenUsed/>
     <w:qFormat/>
-    <w:rsid w:val="00573F19"/>
+    <w:rsid w:val="00805316"/>
     <w:pPr>
       <w:keepNext/>
       <w:keepLines/>
@@ -767,7 +767,7 @@
     <w:semiHidden/>
     <w:unhideWhenUsed/>
     <w:qFormat/>
-    <w:rsid w:val="00573F19"/>
+    <w:rsid w:val="00805316"/>
     <w:pPr>
       <w:keepNext/>
       <w:keepLines/>
@@ -790,7 +790,7 @@
     <w:semiHidden/>
     <w:unhideWhenUsed/>
     <w:qFormat/>
-    <w:rsid w:val="00573F19"/>
+    <w:rsid w:val="00805316"/>
     <w:pPr>
       <w:keepNext/>
       <w:keepLines/>
@@ -811,7 +811,7 @@
     <w:semiHidden/>
     <w:unhideWhenUsed/>
     <w:qFormat/>
-    <w:rsid w:val="00573F19"/>
+    <w:rsid w:val="00805316"/>
     <w:pPr>
       <w:keepNext/>
       <w:keepLines/>
@@ -834,7 +834,7 @@
     <w:semiHidden/>
     <w:unhideWhenUsed/>
     <w:qFormat/>
-    <w:rsid w:val="00573F19"/>
+    <w:rsid w:val="00805316"/>
     <w:pPr>
       <w:keepNext/>
       <w:keepLines/>
@@ -878,7 +878,7 @@
     <w:basedOn w:val="a0"/>
     <w:link w:val="1"/>
     <w:uiPriority w:val="9"/>
-    <w:rsid w:val="00573F19"/>
+    <w:rsid w:val="00805316"/>
     <w:rPr>
       <w:rFonts w:asciiTheme="majorHAnsi" w:eastAsiaTheme="majorEastAsia" w:hAnsiTheme="majorHAnsi" w:cstheme="majorBidi"/>
       <w:color w:val="0F4761" w:themeColor="accent1" w:themeShade="BF"/>
@@ -892,7 +892,7 @@
     <w:link w:val="2"/>
     <w:uiPriority w:val="9"/>
     <w:semiHidden/>
-    <w:rsid w:val="00573F19"/>
+    <w:rsid w:val="00805316"/>
     <w:rPr>
       <w:rFonts w:asciiTheme="majorHAnsi" w:eastAsiaTheme="majorEastAsia" w:hAnsiTheme="majorHAnsi" w:cstheme="majorBidi"/>
       <w:color w:val="0F4761" w:themeColor="accent1" w:themeShade="BF"/>
@@ -906,7 +906,7 @@
     <w:link w:val="3"/>
     <w:uiPriority w:val="9"/>
     <w:semiHidden/>
-    <w:rsid w:val="00573F19"/>
+    <w:rsid w:val="00805316"/>
     <w:rPr>
       <w:rFonts w:eastAsiaTheme="majorEastAsia" w:cstheme="majorBidi"/>
       <w:color w:val="0F4761" w:themeColor="accent1" w:themeShade="BF"/>
@@ -920,7 +920,7 @@
     <w:link w:val="4"/>
     <w:uiPriority w:val="9"/>
     <w:semiHidden/>
-    <w:rsid w:val="00573F19"/>
+    <w:rsid w:val="00805316"/>
     <w:rPr>
       <w:rFonts w:eastAsiaTheme="majorEastAsia" w:cstheme="majorBidi"/>
       <w:i/>
@@ -934,7 +934,7 @@
     <w:link w:val="5"/>
     <w:uiPriority w:val="9"/>
     <w:semiHidden/>
-    <w:rsid w:val="00573F19"/>
+    <w:rsid w:val="00805316"/>
     <w:rPr>
       <w:rFonts w:eastAsiaTheme="majorEastAsia" w:cstheme="majorBidi"/>
       <w:color w:val="0F4761" w:themeColor="accent1" w:themeShade="BF"/>
@@ -946,7 +946,7 @@
     <w:link w:val="6"/>
     <w:uiPriority w:val="9"/>
     <w:semiHidden/>
-    <w:rsid w:val="00573F19"/>
+    <w:rsid w:val="00805316"/>
     <w:rPr>
       <w:rFonts w:eastAsiaTheme="majorEastAsia" w:cstheme="majorBidi"/>
       <w:i/>
@@ -960,7 +960,7 @@
     <w:link w:val="7"/>
     <w:uiPriority w:val="9"/>
     <w:semiHidden/>
-    <w:rsid w:val="00573F19"/>
+    <w:rsid w:val="00805316"/>
     <w:rPr>
       <w:rFonts w:eastAsiaTheme="majorEastAsia" w:cstheme="majorBidi"/>
       <w:color w:val="595959" w:themeColor="text1" w:themeTint="A6"/>
@@ -972,7 +972,7 @@
     <w:link w:val="8"/>
     <w:uiPriority w:val="9"/>
     <w:semiHidden/>
-    <w:rsid w:val="00573F19"/>
+    <w:rsid w:val="00805316"/>
     <w:rPr>
       <w:rFonts w:eastAsiaTheme="majorEastAsia" w:cstheme="majorBidi"/>
       <w:i/>
@@ -986,7 +986,7 @@
     <w:link w:val="9"/>
     <w:uiPriority w:val="9"/>
     <w:semiHidden/>
-    <w:rsid w:val="00573F19"/>
+    <w:rsid w:val="00805316"/>
     <w:rPr>
       <w:rFonts w:eastAsiaTheme="majorEastAsia" w:cstheme="majorBidi"/>
       <w:color w:val="272727" w:themeColor="text1" w:themeTint="D8"/>
@@ -999,7 +999,7 @@
     <w:link w:val="a4"/>
     <w:uiPriority w:val="10"/>
     <w:qFormat/>
-    <w:rsid w:val="00573F19"/>
+    <w:rsid w:val="00805316"/>
     <w:pPr>
       <w:spacing w:after="80" w:line="240" w:lineRule="auto"/>
       <w:contextualSpacing/>
@@ -1017,7 +1017,7 @@
     <w:basedOn w:val="a0"/>
     <w:link w:val="a3"/>
     <w:uiPriority w:val="10"/>
-    <w:rsid w:val="00573F19"/>
+    <w:rsid w:val="00805316"/>
     <w:rPr>
       <w:rFonts w:asciiTheme="majorHAnsi" w:eastAsiaTheme="majorEastAsia" w:hAnsiTheme="majorHAnsi" w:cstheme="majorBidi"/>
       <w:spacing w:val="-10"/>
@@ -1033,7 +1033,7 @@
     <w:link w:val="a6"/>
     <w:uiPriority w:val="11"/>
     <w:qFormat/>
-    <w:rsid w:val="00573F19"/>
+    <w:rsid w:val="00805316"/>
     <w:pPr>
       <w:numPr>
         <w:ilvl w:val="1"/>
@@ -1052,7 +1052,7 @@
     <w:basedOn w:val="a0"/>
     <w:link w:val="a5"/>
     <w:uiPriority w:val="11"/>
-    <w:rsid w:val="00573F19"/>
+    <w:rsid w:val="00805316"/>
     <w:rPr>
       <w:rFonts w:eastAsiaTheme="majorEastAsia" w:cstheme="majorBidi"/>
       <w:color w:val="595959" w:themeColor="text1" w:themeTint="A6"/>
@@ -1068,7 +1068,7 @@
     <w:link w:val="22"/>
     <w:uiPriority w:val="29"/>
     <w:qFormat/>
-    <w:rsid w:val="00573F19"/>
+    <w:rsid w:val="00805316"/>
     <w:pPr>
       <w:spacing w:before="160"/>
       <w:jc w:val="center"/>
@@ -1084,7 +1084,7 @@
     <w:basedOn w:val="a0"/>
     <w:link w:val="21"/>
     <w:uiPriority w:val="29"/>
-    <w:rsid w:val="00573F19"/>
+    <w:rsid w:val="00805316"/>
     <w:rPr>
       <w:i/>
       <w:iCs/>
@@ -1096,7 +1096,7 @@
     <w:basedOn w:val="a"/>
     <w:uiPriority w:val="34"/>
     <w:qFormat/>
-    <w:rsid w:val="00573F19"/>
+    <w:rsid w:val="00805316"/>
     <w:pPr>
       <w:ind w:left="720"/>
       <w:contextualSpacing/>
@@ -1107,7 +1107,7 @@
     <w:basedOn w:val="a0"/>
     <w:uiPriority w:val="21"/>
     <w:qFormat/>
-    <w:rsid w:val="00573F19"/>
+    <w:rsid w:val="00805316"/>
     <w:rPr>
       <w:i/>
       <w:iCs/>
@@ -1121,7 +1121,7 @@
     <w:link w:val="aa"/>
     <w:uiPriority w:val="30"/>
     <w:qFormat/>
-    <w:rsid w:val="00573F19"/>
+    <w:rsid w:val="00805316"/>
     <w:pPr>
       <w:pBdr>
         <w:top w:val="single" w:sz="4" w:space="10" w:color="0F4761" w:themeColor="accent1" w:themeShade="BF"/>
@@ -1142,7 +1142,7 @@
     <w:basedOn w:val="a0"/>
     <w:link w:val="a9"/>
     <w:uiPriority w:val="30"/>
-    <w:rsid w:val="00573F19"/>
+    <w:rsid w:val="00805316"/>
     <w:rPr>
       <w:i/>
       <w:iCs/>
@@ -1154,7 +1154,7 @@
     <w:basedOn w:val="a0"/>
     <w:uiPriority w:val="32"/>
     <w:qFormat/>
-    <w:rsid w:val="00573F19"/>
+    <w:rsid w:val="00805316"/>
     <w:rPr>
       <w:b/>
       <w:bCs/>

</xml_diff>

<commit_message>
Final cleanup: remove all remaining dashes and hyphens from Tinkoff article
</commit_message>
<xml_diff>
--- a/ответы/тинькофф-журнал-ии-в-крупных-компаниях.docx
+++ b/ответы/тинькофф-журнал-ии-в-крупных-компаниях.docx
@@ -103,7 +103,19 @@
     <w:p/>
     <w:p>
       <w:r>
-        <w:t>Первая типичная причина — некачественные данные. Искусственный интеллект обучается на исторических данных компании, и если они неполные, несогласованные или устаревшие, модель воспроизводит ошибки прошлого с высокой точностью. Один крупный ретейлер потратил год на внедрение системы прогнозирования спроса, которая давала худшие результаты, чем Excel-таблицы менеджеров, потому что данные из разных филиалов вносились по разным правилам.</w:t>
+        <w:t xml:space="preserve">Первая типичная причина — некачественные данные. Искусственный интеллект обучается на исторических данных компании, </w:t>
+      </w:r>
+      <w:proofErr w:type="gramStart"/>
+      <w:r>
+        <w:t>и</w:t>
+      </w:r>
+      <w:proofErr w:type="gramEnd"/>
+      <w:r>
+        <w:t xml:space="preserve"> если они неполные, несогласованные или устаревшие, модель воспроизводит ошибки прошлого с </w:t>
+      </w:r>
+      <w:r>
+        <w:lastRenderedPageBreak/>
+        <w:t>высокой точностью. Один крупный ретейлер потратил год на внедрение системы прогнозирования спроса, которая давала худшие результаты, чем Excel-таблицы менеджеров, потому что данные из разных филиалов вносились по разным правилам.</w:t>
       </w:r>
     </w:p>
     <w:p/>
@@ -140,12 +152,19 @@
     <w:p/>
     <w:p>
       <w:r>
-        <w:t>Один из главных сдвигов — работа с неструктурированными данными. Раньше компании работали с тем, что можно посчитать: продажи, клики, транзакции. Теперь искусственный интеллект обрабатывает отзывы клиентов, звонки в службу поддержки, переписку в чатах, новости о конкурентах и извлекает из этого закономерности. Производитель потребительских товаров может узнать, что покупатели в конкретном регионе недовольны упаковкой, раньше, чем это отразится в падении продаж.</w:t>
-      </w:r>
-    </w:p>
-    <w:p/>
-    <w:p>
-      <w:r>
+        <w:t>Один из главных сдвигов</w:t>
+      </w:r>
+      <w:r>
+        <w:t xml:space="preserve">, это </w:t>
+      </w:r>
+      <w:r>
+        <w:t>работа с неструктурированными данными. Раньше компании работали с тем, что можно посчитать: продажи, клики, транзакции. Теперь искусственный интеллект обрабатывает отзывы клиентов, звонки в службу поддержки, переписку в чатах, новости о конкурентах и извлекает из этого закономерности. Производитель потребительских товаров может узнать, что покупатели в конкретном регионе недовольны упаковкой, раньше, чем это отразится в падении продаж.</w:t>
+      </w:r>
+    </w:p>
+    <w:p/>
+    <w:p>
+      <w:r>
+        <w:lastRenderedPageBreak/>
         <w:t>Другой важный сдвиг — персонализация в масштабе. Раньше это была привилегия премиум-сегмента. Сейчас банк с 10 миллионами клиентов может предлагать каждому продукт под его финансовое поведение и делать это в реальном времени.</w:t>
       </w:r>
     </w:p>
@@ -170,8 +189,13 @@
     </w:p>
     <w:p/>
     <w:p>
-      <w:r>
-        <w:t>Дашборды реального времени дают руководителю не отчёт за прошлый месяц, а текущее состояние бизнеса прямо сейчас: выручка, отток клиентов, загрузка производства, отклонения от плана. Аномалии система выделяет автоматически, и не нужно искать иголку в стоге данных.</w:t>
+      <w:proofErr w:type="spellStart"/>
+      <w:r>
+        <w:t>Дашборды</w:t>
+      </w:r>
+      <w:proofErr w:type="spellEnd"/>
+      <w:r>
+        <w:t xml:space="preserve"> реального времени дают руководителю не отчёт за прошлый месяц, а текущее состояние бизнеса прямо сейчас: выручка, отток клиентов, загрузка производства, отклонения от плана. Аномалии система выделяет автоматически, и не нужно искать иголку в стоге данных.</w:t>
       </w:r>
     </w:p>
     <w:p/>
@@ -189,6 +213,7 @@
     <w:p/>
     <w:p>
       <w:r>
+        <w:lastRenderedPageBreak/>
         <w:t>Главный принцип остаётся простым. ИИ должен сокращать время от вопроса до ответа и не создавать новый слой сложности.</w:t>
       </w:r>
     </w:p>
@@ -232,6 +257,7 @@
     <w:p/>
     <w:p>
       <w:r>
+        <w:lastRenderedPageBreak/>
         <w:t>Компании, которые встраивают этику в архитектуру своих систем с самого начала, тратят на это значительно меньше, чем те, кто исправляет последствия потом.</w:t>
       </w:r>
     </w:p>

</xml_diff>

<commit_message>
Add Cyber Media IoT security article with date-prefixed filenames
</commit_message>
<xml_diff>
--- a/ответы/тинькофф-журнал-ии-в-крупных-компаниях.docx
+++ b/ответы/тинькофф-журнал-ии-в-крупных-компаниях.docx
@@ -41,13 +41,13 @@
     <w:p/>
     <w:p>
       <w:r>
-        <w:t>Третья область — финансы и безопасность. Системы защиты от мошенничества, кредитный скоринг, выявление аномалий в транзакциях. Искусственный интеллект работает здесь в реальном времени и принимает тысячи решений в секунду, что физически недоступно ни одному человеку.</w:t>
-      </w:r>
-    </w:p>
-    <w:p/>
-    <w:p>
-      <w:r>
-        <w:t>Четвёртое направление — HR и рекрутинг. Первичный отбор резюме, анализ текучести кадров, прогнозирование выгорания сотрудников. Для компаний с тысячами людей это экономия сотен часов работы рекрутеров ежемесячно.</w:t>
+        <w:t>Третья область это финансы и безопасность. Системы защиты от мошенничества, кредитный скоринг, выявление аномалий в транзакциях. Искусственный интеллект работает здесь в реальном времени и принимает тысячи решений в секунду, что физически недоступно ни одному человеку.</w:t>
+      </w:r>
+    </w:p>
+    <w:p/>
+    <w:p>
+      <w:r>
+        <w:t>Четвёртое направление это HR и рекрутинг. Первичный отбор резюме, анализ текучести кадров, прогнозирование выгорания сотрудников. Для компаний с тысячами людей это экономия сотен часов работы рекрутеров ежемесячно.</w:t>
       </w:r>
     </w:p>
     <w:p/>
@@ -103,31 +103,19 @@
     <w:p/>
     <w:p>
       <w:r>
-        <w:t xml:space="preserve">Первая типичная причина — некачественные данные. Искусственный интеллект обучается на исторических данных компании, </w:t>
-      </w:r>
-      <w:proofErr w:type="gramStart"/>
-      <w:r>
-        <w:t>и</w:t>
-      </w:r>
-      <w:proofErr w:type="gramEnd"/>
-      <w:r>
-        <w:t xml:space="preserve"> если они неполные, несогласованные или устаревшие, модель воспроизводит ошибки прошлого с </w:t>
-      </w:r>
-      <w:r>
-        <w:lastRenderedPageBreak/>
-        <w:t>высокой точностью. Один крупный ретейлер потратил год на внедрение системы прогнозирования спроса, которая давала худшие результаты, чем Excel-таблицы менеджеров, потому что данные из разных филиалов вносились по разным правилам.</w:t>
-      </w:r>
-    </w:p>
-    <w:p/>
-    <w:p>
-      <w:r>
-        <w:t>Вторая причина — внедрение ради отчётности. Компания покупает дорогое решение, чтобы отчитаться перед советом директоров о цифровизации. Систему внедряют, но под неё не перестраивают процессы. Люди работают по-старому, параллельно заполняя новую систему, KPI не меняются, эффект нулевой.</w:t>
-      </w:r>
-    </w:p>
-    <w:p/>
-    <w:p>
-      <w:r>
-        <w:t>Третья причина — сопротивление сотрудников. Оно особенно острое там, где ИИ воспринимается как инструмент контроля или угроза рабочим местам. Если команда саботирует новую систему или вносит в неё недостоверные данные, она никогда не заработает правильно.</w:t>
+        <w:t>Первая типичная причина связана с некачественными данными. Искусственный интеллект обучается на исторических данных компании, и если они неполные, несогласованные или устаревшие, модель воспроизводит ошибки прошлого с высокой точностью. Один крупный ретейлер потратил год на внедрение системы прогнозирования спроса, которая давала худшие результаты, чем таблицы менеджеров в Excel, потому что данные из разных филиалов вносились по разным правилам.</w:t>
+      </w:r>
+    </w:p>
+    <w:p/>
+    <w:p>
+      <w:r>
+        <w:t>Вторая причина это внедрение ради отчётности. Компания покупает дорогое решение, чтобы отчитаться перед советом директоров о цифровизации. Систему внедряют, но под неё не перестраивают процессы. Люди работают как прежде, параллельно заполняя новую систему, KPI не меняются, эффект нулевой.</w:t>
+      </w:r>
+    </w:p>
+    <w:p/>
+    <w:p>
+      <w:r>
+        <w:t>Третья причина это сопротивление сотрудников. Оно особенно острое там, где ИИ воспринимается как инструмент контроля или угроза рабочим местам. Если команда саботирует новую систему или вносит в неё недостоверные данные, она никогда не заработает правильно.</w:t>
       </w:r>
     </w:p>
     <w:p/>
@@ -146,32 +134,25 @@
     <w:p/>
     <w:p>
       <w:r>
-        <w:t>Ключевое слово здесь — новые. Речь не о том, чтобы быстрее делать то, что раньше делали медленно. Речь о задачах, которые раньше были физически невозможны.</w:t>
-      </w:r>
-    </w:p>
-    <w:p/>
-    <w:p>
-      <w:r>
-        <w:t>Один из главных сдвигов</w:t>
-      </w:r>
-      <w:r>
-        <w:t xml:space="preserve">, это </w:t>
-      </w:r>
-      <w:r>
-        <w:t>работа с неструктурированными данными. Раньше компании работали с тем, что можно посчитать: продажи, клики, транзакции. Теперь искусственный интеллект обрабатывает отзывы клиентов, звонки в службу поддержки, переписку в чатах, новости о конкурентах и извлекает из этого закономерности. Производитель потребительских товаров может узнать, что покупатели в конкретном регионе недовольны упаковкой, раньше, чем это отразится в падении продаж.</w:t>
-      </w:r>
-    </w:p>
-    <w:p/>
-    <w:p>
-      <w:r>
-        <w:lastRenderedPageBreak/>
-        <w:t>Другой важный сдвиг — персонализация в масштабе. Раньше это была привилегия премиум-сегмента. Сейчас банк с 10 миллионами клиентов может предлагать каждому продукт под его финансовое поведение и делать это в реальном времени.</w:t>
-      </w:r>
-    </w:p>
-    <w:p/>
-    <w:p>
-      <w:r>
-        <w:t>Третий сдвиг — переход от реакции к прогнозированию. Традиционная аналитика отвечает на вопрос о том, что произошло. Искусственный интеллект отвечает на вопрос о том, что произойдёт. Компания, которая предвидит изменение спроса за три месяца, успевает перестроить производство. Компания, реагирующая по факту, теряет рынок.</w:t>
+        <w:t>Главное слово здесь «новые». Речь не о том, чтобы быстрее делать то, что раньше делали медленно. Речь о задачах, которые раньше были физически невозможны.</w:t>
+      </w:r>
+    </w:p>
+    <w:p/>
+    <w:p>
+      <w:r>
+        <w:t>Один из главных сдвигов связан с работой с неструктурированными данными. Раньше компании работали с тем, что можно посчитать: продажи, клики, транзакции. Теперь искусственный интеллект обрабатывает отзывы клиентов, звонки в службу поддержки, переписку в чатах, новости о конкурентах и извлекает из этого закономерности. Производитель потребительских товаров может узнать, что покупатели в конкретном регионе недовольны упаковкой, раньше, чем это отразится в падении продаж.</w:t>
+      </w:r>
+    </w:p>
+    <w:p/>
+    <w:p>
+      <w:r>
+        <w:t>Другой важный сдвиг связан с персонализацией в масштабе. Раньше это была привилегия премиального сегмента. Сейчас банк с 10 миллионами клиентов может предлагать каждому продукт под его финансовое поведение и делать это в реальном времени.</w:t>
+      </w:r>
+    </w:p>
+    <w:p/>
+    <w:p>
+      <w:r>
+        <w:t>Третий сдвиг связан с переходом от реакции к прогнозированию. Традиционная аналитика отвечает на вопрос о том, что произошло. Искусственный интеллект отвечает на вопрос о том, что произойдёт. Компания, которая предвидит изменение спроса за три месяца, успевает перестроить производство. Компания, реагирующая по факту, теряет рынок.</w:t>
       </w:r>
     </w:p>
     <w:p/>
@@ -184,18 +165,13 @@
     <w:p/>
     <w:p>
       <w:r>
-        <w:t>Топ-менеджер крупной компании принимает десятки решений в день, каждое из которых опирается на неполную информацию. Искусственный интеллект не принимает решения за него, но меняет качество информации, с которой он работает.</w:t>
-      </w:r>
-    </w:p>
-    <w:p/>
-    <w:p>
-      <w:proofErr w:type="spellStart"/>
-      <w:r>
-        <w:t>Дашборды</w:t>
-      </w:r>
-      <w:proofErr w:type="spellEnd"/>
-      <w:r>
-        <w:t xml:space="preserve"> реального времени дают руководителю не отчёт за прошлый месяц, а текущее состояние бизнеса прямо сейчас: выручка, отток клиентов, загрузка производства, отклонения от плана. Аномалии система выделяет автоматически, и не нужно искать иголку в стоге данных.</w:t>
+        <w:t>Руководитель крупной компании принимает десятки решений в день, каждое из которых опирается на неполную информацию. Искусственный интеллект не принимает решения за него, но меняет качество информации, с которой он работает.</w:t>
+      </w:r>
+    </w:p>
+    <w:p/>
+    <w:p>
+      <w:r>
+        <w:t>Дашборды реального времени дают руководителю не отчёт за прошлый месяц, а текущее состояние бизнеса прямо сейчас: выручка, отток клиентов, загрузка производства, отклонения от плана. Аномалии система выделяет автоматически, и не нужно искать иголку в стоге данных.</w:t>
       </w:r>
     </w:p>
     <w:p/>
@@ -213,7 +189,6 @@
     <w:p/>
     <w:p>
       <w:r>
-        <w:lastRenderedPageBreak/>
         <w:t>Главный принцип остаётся простым. ИИ должен сокращать время от вопроса до ответа и не создавать новый слой сложности.</w:t>
       </w:r>
     </w:p>
@@ -233,19 +208,19 @@
     <w:p/>
     <w:p>
       <w:r>
-        <w:t>Первый риск — дискриминация алгоритмов. Модель, обученная на исторических данных, воспроизводит исторические предубеждения. Банки в ряде стран столкнулись с судебными исками за кредитные отказы, которые непропорционально часто получали представители определённых групп. Происходило это не потому, что такова была цель, а потому что так выглядели исторические данные. В России регуляторное давление пока мягче, но международная практика формирует стандарты, которые придут и сюда.</w:t>
-      </w:r>
-    </w:p>
-    <w:p/>
-    <w:p>
-      <w:r>
-        <w:t>Второй риск — нарушение законодательства о персональных данных. 152-ФЗ и GDPR для международных компаний это не формальности. Системы, обучающиеся на клиентских данных, должны соответствовать требованиям закона, а нарушение означает штрафы, предписания и приостановку работы.</w:t>
-      </w:r>
-    </w:p>
-    <w:p/>
-    <w:p>
-      <w:r>
-        <w:t>Третий риск — необъяснимость решений. Если система отказала клиенту в кредите или уволила сотрудника по результатам оценки, компания должна быть готова объяснить почему. Ссылка на алгоритм не является юридически приемлемым ответом в большинстве юрисдикций. Это требует использования объяснимых моделей или дополнительного слоя интерпретации.</w:t>
+        <w:t>Первый риск это дискриминация алгоритмов. Модель, обученная на исторических данных, воспроизводит исторические предубеждения. Банки в ряде стран столкнулись с судебными исками за кредитные отказы, которые непропорционально часто получали представители определённых групп. Происходило это не потому, что такова была цель, а потому что так выглядели исторические данные. В России регуляторное давление пока мягче, но международная практика формирует стандарты, которые придут и сюда.</w:t>
+      </w:r>
+    </w:p>
+    <w:p/>
+    <w:p>
+      <w:r>
+        <w:t>Второй риск состоит в нарушении законодательства о персональных данных. Федеральный закон 152 и GDPR для международных компаний это не формальности. Системы, обучающиеся на клиентских данных, должны соответствовать требованиям закона, а нарушение означает штрафы, предписания и приостановку работы.</w:t>
+      </w:r>
+    </w:p>
+    <w:p/>
+    <w:p>
+      <w:r>
+        <w:t>Третий риск это необъяснимость решений. Если система отказала клиенту в кредите или уволила сотрудника по результатам оценки, компания должна быть готова объяснить почему. Ссылка на алгоритм не является юридически приемлемым ответом в большинстве юрисдикций. Это требует использования объяснимых моделей или дополнительного слоя интерпретации.</w:t>
       </w:r>
     </w:p>
     <w:p/>
@@ -257,7 +232,6 @@
     <w:p/>
     <w:p>
       <w:r>
-        <w:lastRenderedPageBreak/>
         <w:t>Компании, которые встраивают этику в архитектуру своих систем с самого начала, тратят на это значительно меньше, чем те, кто исправляет последствия потом.</w:t>
       </w:r>
     </w:p>
@@ -680,7 +654,7 @@
     <w:link w:val="10"/>
     <w:uiPriority w:val="9"/>
     <w:qFormat/>
-    <w:rsid w:val="00805316"/>
+    <w:rsid w:val="002234BC"/>
     <w:pPr>
       <w:keepNext/>
       <w:keepLines/>
@@ -703,7 +677,7 @@
     <w:semiHidden/>
     <w:unhideWhenUsed/>
     <w:qFormat/>
-    <w:rsid w:val="00805316"/>
+    <w:rsid w:val="002234BC"/>
     <w:pPr>
       <w:keepNext/>
       <w:keepLines/>
@@ -726,7 +700,7 @@
     <w:semiHidden/>
     <w:unhideWhenUsed/>
     <w:qFormat/>
-    <w:rsid w:val="00805316"/>
+    <w:rsid w:val="002234BC"/>
     <w:pPr>
       <w:keepNext/>
       <w:keepLines/>
@@ -749,7 +723,7 @@
     <w:semiHidden/>
     <w:unhideWhenUsed/>
     <w:qFormat/>
-    <w:rsid w:val="00805316"/>
+    <w:rsid w:val="002234BC"/>
     <w:pPr>
       <w:keepNext/>
       <w:keepLines/>
@@ -772,7 +746,7 @@
     <w:semiHidden/>
     <w:unhideWhenUsed/>
     <w:qFormat/>
-    <w:rsid w:val="00805316"/>
+    <w:rsid w:val="002234BC"/>
     <w:pPr>
       <w:keepNext/>
       <w:keepLines/>
@@ -793,7 +767,7 @@
     <w:semiHidden/>
     <w:unhideWhenUsed/>
     <w:qFormat/>
-    <w:rsid w:val="00805316"/>
+    <w:rsid w:val="002234BC"/>
     <w:pPr>
       <w:keepNext/>
       <w:keepLines/>
@@ -816,7 +790,7 @@
     <w:semiHidden/>
     <w:unhideWhenUsed/>
     <w:qFormat/>
-    <w:rsid w:val="00805316"/>
+    <w:rsid w:val="002234BC"/>
     <w:pPr>
       <w:keepNext/>
       <w:keepLines/>
@@ -837,7 +811,7 @@
     <w:semiHidden/>
     <w:unhideWhenUsed/>
     <w:qFormat/>
-    <w:rsid w:val="00805316"/>
+    <w:rsid w:val="002234BC"/>
     <w:pPr>
       <w:keepNext/>
       <w:keepLines/>
@@ -860,7 +834,7 @@
     <w:semiHidden/>
     <w:unhideWhenUsed/>
     <w:qFormat/>
-    <w:rsid w:val="00805316"/>
+    <w:rsid w:val="002234BC"/>
     <w:pPr>
       <w:keepNext/>
       <w:keepLines/>
@@ -904,7 +878,7 @@
     <w:basedOn w:val="a0"/>
     <w:link w:val="1"/>
     <w:uiPriority w:val="9"/>
-    <w:rsid w:val="00805316"/>
+    <w:rsid w:val="002234BC"/>
     <w:rPr>
       <w:rFonts w:asciiTheme="majorHAnsi" w:eastAsiaTheme="majorEastAsia" w:hAnsiTheme="majorHAnsi" w:cstheme="majorBidi"/>
       <w:color w:val="0F4761" w:themeColor="accent1" w:themeShade="BF"/>
@@ -918,7 +892,7 @@
     <w:link w:val="2"/>
     <w:uiPriority w:val="9"/>
     <w:semiHidden/>
-    <w:rsid w:val="00805316"/>
+    <w:rsid w:val="002234BC"/>
     <w:rPr>
       <w:rFonts w:asciiTheme="majorHAnsi" w:eastAsiaTheme="majorEastAsia" w:hAnsiTheme="majorHAnsi" w:cstheme="majorBidi"/>
       <w:color w:val="0F4761" w:themeColor="accent1" w:themeShade="BF"/>
@@ -932,7 +906,7 @@
     <w:link w:val="3"/>
     <w:uiPriority w:val="9"/>
     <w:semiHidden/>
-    <w:rsid w:val="00805316"/>
+    <w:rsid w:val="002234BC"/>
     <w:rPr>
       <w:rFonts w:eastAsiaTheme="majorEastAsia" w:cstheme="majorBidi"/>
       <w:color w:val="0F4761" w:themeColor="accent1" w:themeShade="BF"/>
@@ -946,7 +920,7 @@
     <w:link w:val="4"/>
     <w:uiPriority w:val="9"/>
     <w:semiHidden/>
-    <w:rsid w:val="00805316"/>
+    <w:rsid w:val="002234BC"/>
     <w:rPr>
       <w:rFonts w:eastAsiaTheme="majorEastAsia" w:cstheme="majorBidi"/>
       <w:i/>
@@ -960,7 +934,7 @@
     <w:link w:val="5"/>
     <w:uiPriority w:val="9"/>
     <w:semiHidden/>
-    <w:rsid w:val="00805316"/>
+    <w:rsid w:val="002234BC"/>
     <w:rPr>
       <w:rFonts w:eastAsiaTheme="majorEastAsia" w:cstheme="majorBidi"/>
       <w:color w:val="0F4761" w:themeColor="accent1" w:themeShade="BF"/>
@@ -972,7 +946,7 @@
     <w:link w:val="6"/>
     <w:uiPriority w:val="9"/>
     <w:semiHidden/>
-    <w:rsid w:val="00805316"/>
+    <w:rsid w:val="002234BC"/>
     <w:rPr>
       <w:rFonts w:eastAsiaTheme="majorEastAsia" w:cstheme="majorBidi"/>
       <w:i/>
@@ -986,7 +960,7 @@
     <w:link w:val="7"/>
     <w:uiPriority w:val="9"/>
     <w:semiHidden/>
-    <w:rsid w:val="00805316"/>
+    <w:rsid w:val="002234BC"/>
     <w:rPr>
       <w:rFonts w:eastAsiaTheme="majorEastAsia" w:cstheme="majorBidi"/>
       <w:color w:val="595959" w:themeColor="text1" w:themeTint="A6"/>
@@ -998,7 +972,7 @@
     <w:link w:val="8"/>
     <w:uiPriority w:val="9"/>
     <w:semiHidden/>
-    <w:rsid w:val="00805316"/>
+    <w:rsid w:val="002234BC"/>
     <w:rPr>
       <w:rFonts w:eastAsiaTheme="majorEastAsia" w:cstheme="majorBidi"/>
       <w:i/>
@@ -1012,7 +986,7 @@
     <w:link w:val="9"/>
     <w:uiPriority w:val="9"/>
     <w:semiHidden/>
-    <w:rsid w:val="00805316"/>
+    <w:rsid w:val="002234BC"/>
     <w:rPr>
       <w:rFonts w:eastAsiaTheme="majorEastAsia" w:cstheme="majorBidi"/>
       <w:color w:val="272727" w:themeColor="text1" w:themeTint="D8"/>
@@ -1025,7 +999,7 @@
     <w:link w:val="a4"/>
     <w:uiPriority w:val="10"/>
     <w:qFormat/>
-    <w:rsid w:val="00805316"/>
+    <w:rsid w:val="002234BC"/>
     <w:pPr>
       <w:spacing w:after="80" w:line="240" w:lineRule="auto"/>
       <w:contextualSpacing/>
@@ -1043,7 +1017,7 @@
     <w:basedOn w:val="a0"/>
     <w:link w:val="a3"/>
     <w:uiPriority w:val="10"/>
-    <w:rsid w:val="00805316"/>
+    <w:rsid w:val="002234BC"/>
     <w:rPr>
       <w:rFonts w:asciiTheme="majorHAnsi" w:eastAsiaTheme="majorEastAsia" w:hAnsiTheme="majorHAnsi" w:cstheme="majorBidi"/>
       <w:spacing w:val="-10"/>
@@ -1059,7 +1033,7 @@
     <w:link w:val="a6"/>
     <w:uiPriority w:val="11"/>
     <w:qFormat/>
-    <w:rsid w:val="00805316"/>
+    <w:rsid w:val="002234BC"/>
     <w:pPr>
       <w:numPr>
         <w:ilvl w:val="1"/>
@@ -1078,7 +1052,7 @@
     <w:basedOn w:val="a0"/>
     <w:link w:val="a5"/>
     <w:uiPriority w:val="11"/>
-    <w:rsid w:val="00805316"/>
+    <w:rsid w:val="002234BC"/>
     <w:rPr>
       <w:rFonts w:eastAsiaTheme="majorEastAsia" w:cstheme="majorBidi"/>
       <w:color w:val="595959" w:themeColor="text1" w:themeTint="A6"/>
@@ -1094,7 +1068,7 @@
     <w:link w:val="22"/>
     <w:uiPriority w:val="29"/>
     <w:qFormat/>
-    <w:rsid w:val="00805316"/>
+    <w:rsid w:val="002234BC"/>
     <w:pPr>
       <w:spacing w:before="160"/>
       <w:jc w:val="center"/>
@@ -1110,7 +1084,7 @@
     <w:basedOn w:val="a0"/>
     <w:link w:val="21"/>
     <w:uiPriority w:val="29"/>
-    <w:rsid w:val="00805316"/>
+    <w:rsid w:val="002234BC"/>
     <w:rPr>
       <w:i/>
       <w:iCs/>
@@ -1122,7 +1096,7 @@
     <w:basedOn w:val="a"/>
     <w:uiPriority w:val="34"/>
     <w:qFormat/>
-    <w:rsid w:val="00805316"/>
+    <w:rsid w:val="002234BC"/>
     <w:pPr>
       <w:ind w:left="720"/>
       <w:contextualSpacing/>
@@ -1133,7 +1107,7 @@
     <w:basedOn w:val="a0"/>
     <w:uiPriority w:val="21"/>
     <w:qFormat/>
-    <w:rsid w:val="00805316"/>
+    <w:rsid w:val="002234BC"/>
     <w:rPr>
       <w:i/>
       <w:iCs/>
@@ -1147,7 +1121,7 @@
     <w:link w:val="aa"/>
     <w:uiPriority w:val="30"/>
     <w:qFormat/>
-    <w:rsid w:val="00805316"/>
+    <w:rsid w:val="002234BC"/>
     <w:pPr>
       <w:pBdr>
         <w:top w:val="single" w:sz="4" w:space="10" w:color="0F4761" w:themeColor="accent1" w:themeShade="BF"/>
@@ -1168,7 +1142,7 @@
     <w:basedOn w:val="a0"/>
     <w:link w:val="a9"/>
     <w:uiPriority w:val="30"/>
-    <w:rsid w:val="00805316"/>
+    <w:rsid w:val="002234BC"/>
     <w:rPr>
       <w:i/>
       <w:iCs/>
@@ -1180,7 +1154,7 @@
     <w:basedOn w:val="a0"/>
     <w:uiPriority w:val="32"/>
     <w:qFormat/>
-    <w:rsid w:val="00805316"/>
+    <w:rsid w:val="002234BC"/>
     <w:rPr>
       <w:b/>
       <w:bCs/>

</xml_diff>